<commit_message>
feat: add Critique Agent + Citation Review Agent; update README & design doc to V2.0
- backend: new CRITIQUE_RUNNING/CITATION_REVIEW_RUNNING states, critique_report/citation_review DB columns, run_critique_step/run_citation_review_step in runner.py
- frontend: critique panel (rose border) + citation review panel (violet border) + progress steps + recommended config entries
- README.md + README.zh-CN.md: updated pipeline, capabilities, USTC-107 model list, API table (token-stream)
- K-Storm-设计文档.docx: bumped to V2.0, added sections 4.4/4.5, updated agent count (7→9), state machine, innovation table (⑪⑫), roadmap
</commit_message>
<xml_diff>
--- a/K-Storm-设计文档.docx
+++ b/K-Storm-设计文档.docx
@@ -378,7 +378,7 @@
                 <w:sz w:val="20"/>
                 <w:szCs w:val="20"/>
               </w:rPr>
-              <w:t xml:space="preserve">7 个</w:t>
+              <w:t xml:space="preserve">9 个</w:t>
             </w:r>
           </w:p>
         </w:tc>
@@ -413,7 +413,7 @@
                 <w:sz w:val="20"/>
                 <w:szCs w:val="20"/>
               </w:rPr>
-              <w:t xml:space="preserve">Intake · Novelty · Mechanism · Feasibility · Reviewer · Moderator · Output</w:t>
+              <w:t xml:space="preserve">Intake · Novelty · Mechanism · Feasibility · Reviewer · Moderator · Critique · Citation Review · Output</w:t>
             </w:r>
           </w:p>
         </w:tc>
@@ -2715,6 +2715,113 @@
                 <w:sz w:val="20"/>
                 <w:szCs w:val="20"/>
               </w:rPr>
+              <w:t xml:space="preserve">CRITIQUE_RUNNING</w:t>
+            </w:r>
+          </w:p>
+        </w:tc>
+        <w:tc>
+          <w:tcPr>
+            <w:tcW w:type="dxa" w:w="3560"/>
+            <w:tcBorders>
+              <w:top w:val="single" w:color="D6E0F2" w:sz="1"/>
+              <w:left w:val="single" w:color="D6E0F2" w:sz="1"/>
+              <w:bottom w:val="single" w:color="D6E0F2" w:sz="1"/>
+              <w:right w:val="single" w:color="D6E0F2" w:sz="1"/>
+            </w:tcBorders>
+            <w:shd w:fill="FFFFFF" w:val="clear"/>
+            <w:tcMar>
+              <w:top w:type="dxa" w:w="80"/>
+              <w:left w:type="dxa" w:w="120"/>
+              <w:bottom w:type="dxa" w:w="80"/>
+              <w:right w:type="dxa" w:w="120"/>
+            </w:tcMar>
+            <w:vAlign w:val="center"/>
+          </w:tcPr>
+          <w:p>
+            <w:pPr>
+              <w:spacing w:after="40" w:before="40"/>
+            </w:pPr>
+            <w:r>
+              <w:rPr>
+                <w:rFonts w:ascii="Arial" w:cs="Arial" w:eastAsia="Arial" w:hAnsi="Arial"/>
+                <w:b w:val="false"/>
+                <w:bCs w:val="false"/>
+                <w:color w:val="0A1628"/>
+                <w:sz w:val="20"/>
+                <w:szCs w:val="20"/>
+              </w:rPr>
+              <w:t xml:space="preserve">Critique Agent 批判审查中</w:t>
+            </w:r>
+          </w:p>
+        </w:tc>
+        <w:tc>
+          <w:tcPr>
+            <w:tcW w:type="dxa" w:w="3200"/>
+            <w:tcBorders>
+              <w:top w:val="single" w:color="D6E0F2" w:sz="1"/>
+              <w:left w:val="single" w:color="D6E0F2" w:sz="1"/>
+              <w:bottom w:val="single" w:color="D6E0F2" w:sz="1"/>
+              <w:right w:val="single" w:color="D6E0F2" w:sz="1"/>
+            </w:tcBorders>
+            <w:shd w:fill="FFFFFF" w:val="clear"/>
+            <w:tcMar>
+              <w:top w:type="dxa" w:w="80"/>
+              <w:left w:type="dxa" w:w="120"/>
+              <w:bottom w:type="dxa" w:w="80"/>
+              <w:right w:type="dxa" w:w="120"/>
+            </w:tcMar>
+            <w:vAlign w:val="center"/>
+          </w:tcPr>
+          <w:p>
+            <w:pPr>
+              <w:spacing w:after="40" w:before="40"/>
+            </w:pPr>
+            <w:r>
+              <w:rPr>
+                <w:rFonts w:ascii="Arial" w:cs="Arial" w:eastAsia="Arial" w:hAnsi="Arial"/>
+                <w:b w:val="false"/>
+                <w:bCs w:val="false"/>
+                <w:color w:val="0A1628"/>
+                <w:sz w:val="20"/>
+                <w:szCs w:val="20"/>
+              </w:rPr>
+              <w:t xml:space="preserve">停止</w:t>
+            </w:r>
+          </w:p>
+        </w:tc>
+      </w:tr>
+      <w:tr>
+        <w:tc>
+          <w:tcPr>
+            <w:tcW w:type="dxa" w:w="2600"/>
+            <w:tcBorders>
+              <w:top w:val="single" w:color="D6E0F2" w:sz="1"/>
+              <w:left w:val="single" w:color="D6E0F2" w:sz="1"/>
+              <w:bottom w:val="single" w:color="D6E0F2" w:sz="1"/>
+              <w:right w:val="single" w:color="D6E0F2" w:sz="1"/>
+            </w:tcBorders>
+            <w:shd w:fill="EEF2FA" w:val="clear"/>
+            <w:tcMar>
+              <w:top w:type="dxa" w:w="80"/>
+              <w:left w:type="dxa" w:w="120"/>
+              <w:bottom w:type="dxa" w:w="80"/>
+              <w:right w:type="dxa" w:w="120"/>
+            </w:tcMar>
+            <w:vAlign w:val="center"/>
+          </w:tcPr>
+          <w:p>
+            <w:pPr>
+              <w:spacing w:after="40" w:before="40"/>
+            </w:pPr>
+            <w:r>
+              <w:rPr>
+                <w:rFonts w:ascii="Arial" w:cs="Arial" w:eastAsia="Arial" w:hAnsi="Arial"/>
+                <w:b w:val="false"/>
+                <w:bCs w:val="false"/>
+                <w:color w:val="0A1628"/>
+                <w:sz w:val="20"/>
+                <w:szCs w:val="20"/>
+              </w:rPr>
               <w:t xml:space="preserve">GROUP_SUMMARY_RUNNING</w:t>
             </w:r>
           </w:p>
@@ -2728,6 +2835,78 @@
               <w:bottom w:val="single" w:color="D6E0F2" w:sz="1"/>
               <w:right w:val="single" w:color="D6E0F2" w:sz="1"/>
             </w:tcBorders>
+            <w:shd w:fill="EEF2FA" w:val="clear"/>
+            <w:tcMar>
+              <w:top w:type="dxa" w:w="80"/>
+              <w:left w:type="dxa" w:w="120"/>
+              <w:bottom w:type="dxa" w:w="80"/>
+              <w:right w:type="dxa" w:w="120"/>
+            </w:tcMar>
+            <w:vAlign w:val="center"/>
+          </w:tcPr>
+          <w:p>
+            <w:pPr>
+              <w:spacing w:after="40" w:before="40"/>
+            </w:pPr>
+            <w:r>
+              <w:rPr>
+                <w:rFonts w:ascii="Arial" w:cs="Arial" w:eastAsia="Arial" w:hAnsi="Arial"/>
+                <w:b w:val="false"/>
+                <w:bCs w:val="false"/>
+                <w:color w:val="0A1628"/>
+                <w:sz w:val="20"/>
+                <w:szCs w:val="20"/>
+              </w:rPr>
+              <w:t xml:space="preserve">结构化 IR 生成中</w:t>
+            </w:r>
+          </w:p>
+        </w:tc>
+        <w:tc>
+          <w:tcPr>
+            <w:tcW w:type="dxa" w:w="3200"/>
+            <w:tcBorders>
+              <w:top w:val="single" w:color="D6E0F2" w:sz="1"/>
+              <w:left w:val="single" w:color="D6E0F2" w:sz="1"/>
+              <w:bottom w:val="single" w:color="D6E0F2" w:sz="1"/>
+              <w:right w:val="single" w:color="D6E0F2" w:sz="1"/>
+            </w:tcBorders>
+            <w:shd w:fill="EEF2FA" w:val="clear"/>
+            <w:tcMar>
+              <w:top w:type="dxa" w:w="80"/>
+              <w:left w:type="dxa" w:w="120"/>
+              <w:bottom w:type="dxa" w:w="80"/>
+              <w:right w:type="dxa" w:w="120"/>
+            </w:tcMar>
+            <w:vAlign w:val="center"/>
+          </w:tcPr>
+          <w:p>
+            <w:pPr>
+              <w:spacing w:after="40" w:before="40"/>
+            </w:pPr>
+            <w:r>
+              <w:rPr>
+                <w:rFonts w:ascii="Arial" w:cs="Arial" w:eastAsia="Arial" w:hAnsi="Arial"/>
+                <w:b w:val="false"/>
+                <w:bCs w:val="false"/>
+                <w:color w:val="0A1628"/>
+                <w:sz w:val="20"/>
+                <w:szCs w:val="20"/>
+              </w:rPr>
+              <w:t xml:space="preserve">停止</w:t>
+            </w:r>
+          </w:p>
+        </w:tc>
+      </w:tr>
+      <w:tr>
+        <w:tc>
+          <w:tcPr>
+            <w:tcW w:type="dxa" w:w="2600"/>
+            <w:tcBorders>
+              <w:top w:val="single" w:color="D6E0F2" w:sz="1"/>
+              <w:left w:val="single" w:color="D6E0F2" w:sz="1"/>
+              <w:bottom w:val="single" w:color="D6E0F2" w:sz="1"/>
+              <w:right w:val="single" w:color="D6E0F2" w:sz="1"/>
+            </w:tcBorders>
             <w:shd w:fill="FFFFFF" w:val="clear"/>
             <w:tcMar>
               <w:top w:type="dxa" w:w="80"/>
@@ -2750,7 +2929,42 @@
                 <w:sz w:val="20"/>
                 <w:szCs w:val="20"/>
               </w:rPr>
-              <w:t xml:space="preserve">结构化 IR 生成中</w:t>
+              <w:t xml:space="preserve">CITATION_REVIEW_RUNNING</w:t>
+            </w:r>
+          </w:p>
+        </w:tc>
+        <w:tc>
+          <w:tcPr>
+            <w:tcW w:type="dxa" w:w="3560"/>
+            <w:tcBorders>
+              <w:top w:val="single" w:color="D6E0F2" w:sz="1"/>
+              <w:left w:val="single" w:color="D6E0F2" w:sz="1"/>
+              <w:bottom w:val="single" w:color="D6E0F2" w:sz="1"/>
+              <w:right w:val="single" w:color="D6E0F2" w:sz="1"/>
+            </w:tcBorders>
+            <w:shd w:fill="FFFFFF" w:val="clear"/>
+            <w:tcMar>
+              <w:top w:type="dxa" w:w="80"/>
+              <w:left w:type="dxa" w:w="120"/>
+              <w:bottom w:type="dxa" w:w="80"/>
+              <w:right w:type="dxa" w:w="120"/>
+            </w:tcMar>
+            <w:vAlign w:val="center"/>
+          </w:tcPr>
+          <w:p>
+            <w:pPr>
+              <w:spacing w:after="40" w:before="40"/>
+            </w:pPr>
+            <w:r>
+              <w:rPr>
+                <w:rFonts w:ascii="Arial" w:cs="Arial" w:eastAsia="Arial" w:hAnsi="Arial"/>
+                <w:b w:val="false"/>
+                <w:bCs w:val="false"/>
+                <w:color w:val="0A1628"/>
+                <w:sz w:val="20"/>
+                <w:szCs w:val="20"/>
+              </w:rPr>
+              <w:t xml:space="preserve">Citation Review Agent 引用审查中</w:t>
             </w:r>
           </w:p>
         </w:tc>
@@ -3169,7 +3383,7 @@
           <w:sz w:val="22"/>
           <w:szCs w:val="22"/>
         </w:rPr>
-        <w:t xml:space="preserve">K-Storm 设计了 7 个专职 Agent，每个 Agent 可独立绑定不同的大模型。角色分工如下：</w:t>
+        <w:t xml:space="preserve">K-Storm 设计了 9 个专职 Agent，每个 Agent 可独立绑定不同的大模型。角色分工如下：</w:t>
       </w:r>
     </w:p>
     <w:p>
@@ -3978,6 +4192,220 @@
                 <w:sz w:val="20"/>
                 <w:szCs w:val="20"/>
               </w:rPr>
+              <w:t xml:space="preserve">Critique Agent</w:t>
+            </w:r>
+          </w:p>
+        </w:tc>
+        <w:tc>
+          <w:tcPr>
+            <w:tcW w:type="dxa" w:w="1800"/>
+            <w:tcBorders>
+              <w:top w:val="single" w:color="D6E0F2" w:sz="1"/>
+              <w:left w:val="single" w:color="D6E0F2" w:sz="1"/>
+              <w:bottom w:val="single" w:color="D6E0F2" w:sz="1"/>
+              <w:right w:val="single" w:color="D6E0F2" w:sz="1"/>
+            </w:tcBorders>
+            <w:shd w:fill="FFFFFF" w:val="clear"/>
+            <w:tcMar>
+              <w:top w:type="dxa" w:w="80"/>
+              <w:left w:type="dxa" w:w="120"/>
+              <w:bottom w:type="dxa" w:w="80"/>
+              <w:right w:type="dxa" w:w="120"/>
+            </w:tcMar>
+            <w:vAlign w:val="center"/>
+          </w:tcPr>
+          <w:p>
+            <w:pPr>
+              <w:spacing w:after="40" w:before="40"/>
+            </w:pPr>
+            <w:r>
+              <w:rPr>
+                <w:rFonts w:ascii="Arial" w:cs="Arial" w:eastAsia="Arial" w:hAnsi="Arial"/>
+                <w:b w:val="false"/>
+                <w:bCs w:val="false"/>
+                <w:color w:val="0A1628"/>
+                <w:sz w:val="20"/>
+                <w:szCs w:val="20"/>
+              </w:rPr>
+              <w:t xml:space="preserve">结构化批判审查</w:t>
+            </w:r>
+          </w:p>
+        </w:tc>
+        <w:tc>
+          <w:tcPr>
+            <w:tcW w:type="dxa" w:w="5360"/>
+            <w:tcBorders>
+              <w:top w:val="single" w:color="D6E0F2" w:sz="1"/>
+              <w:left w:val="single" w:color="D6E0F2" w:sz="1"/>
+              <w:bottom w:val="single" w:color="D6E0F2" w:sz="1"/>
+              <w:right w:val="single" w:color="D6E0F2" w:sz="1"/>
+            </w:tcBorders>
+            <w:shd w:fill="FFFFFF" w:val="clear"/>
+            <w:tcMar>
+              <w:top w:type="dxa" w:w="80"/>
+              <w:left w:type="dxa" w:w="120"/>
+              <w:bottom w:type="dxa" w:w="80"/>
+              <w:right w:type="dxa" w:w="120"/>
+            </w:tcMar>
+            <w:vAlign w:val="center"/>
+          </w:tcPr>
+          <w:p>
+            <w:pPr>
+              <w:spacing w:after="40" w:before="40"/>
+            </w:pPr>
+            <w:r>
+              <w:rPr>
+                <w:rFonts w:ascii="Arial" w:cs="Arial" w:eastAsia="Arial" w:hAnsi="Arial"/>
+                <w:b w:val="false"/>
+                <w:bCs w:val="false"/>
+                <w:color w:val="0A1628"/>
+                <w:sz w:val="20"/>
+                <w:szCs w:val="20"/>
+              </w:rPr>
+              <w:t xml:space="preserve">所有轮次结束后对整体讨论进行六维风险评估，产出独立批判报告（新增）</w:t>
+            </w:r>
+          </w:p>
+        </w:tc>
+      </w:tr>
+      <w:tr>
+        <w:tc>
+          <w:tcPr>
+            <w:tcW w:type="dxa" w:w="2200"/>
+            <w:tcBorders>
+              <w:top w:val="single" w:color="D6E0F2" w:sz="1"/>
+              <w:left w:val="single" w:color="D6E0F2" w:sz="1"/>
+              <w:bottom w:val="single" w:color="D6E0F2" w:sz="1"/>
+              <w:right w:val="single" w:color="D6E0F2" w:sz="1"/>
+            </w:tcBorders>
+            <w:shd w:fill="EEF2FA" w:val="clear"/>
+            <w:tcMar>
+              <w:top w:type="dxa" w:w="80"/>
+              <w:left w:type="dxa" w:w="120"/>
+              <w:bottom w:type="dxa" w:w="80"/>
+              <w:right w:type="dxa" w:w="120"/>
+            </w:tcMar>
+            <w:vAlign w:val="center"/>
+          </w:tcPr>
+          <w:p>
+            <w:pPr>
+              <w:spacing w:after="40" w:before="40"/>
+            </w:pPr>
+            <w:r>
+              <w:rPr>
+                <w:rFonts w:ascii="Arial" w:cs="Arial" w:eastAsia="Arial" w:hAnsi="Arial"/>
+                <w:b w:val="false"/>
+                <w:bCs w:val="false"/>
+                <w:color w:val="0A1628"/>
+                <w:sz w:val="20"/>
+                <w:szCs w:val="20"/>
+              </w:rPr>
+              <w:t xml:space="preserve">Citation Review Agent</w:t>
+            </w:r>
+          </w:p>
+        </w:tc>
+        <w:tc>
+          <w:tcPr>
+            <w:tcW w:type="dxa" w:w="1800"/>
+            <w:tcBorders>
+              <w:top w:val="single" w:color="D6E0F2" w:sz="1"/>
+              <w:left w:val="single" w:color="D6E0F2" w:sz="1"/>
+              <w:bottom w:val="single" w:color="D6E0F2" w:sz="1"/>
+              <w:right w:val="single" w:color="D6E0F2" w:sz="1"/>
+            </w:tcBorders>
+            <w:shd w:fill="EEF2FA" w:val="clear"/>
+            <w:tcMar>
+              <w:top w:type="dxa" w:w="80"/>
+              <w:left w:type="dxa" w:w="120"/>
+              <w:bottom w:type="dxa" w:w="80"/>
+              <w:right w:type="dxa" w:w="120"/>
+            </w:tcMar>
+            <w:vAlign w:val="center"/>
+          </w:tcPr>
+          <w:p>
+            <w:pPr>
+              <w:spacing w:after="40" w:before="40"/>
+            </w:pPr>
+            <w:r>
+              <w:rPr>
+                <w:rFonts w:ascii="Arial" w:cs="Arial" w:eastAsia="Arial" w:hAnsi="Arial"/>
+                <w:b w:val="false"/>
+                <w:bCs w:val="false"/>
+                <w:color w:val="0A1628"/>
+                <w:sz w:val="20"/>
+                <w:szCs w:val="20"/>
+              </w:rPr>
+              <w:t xml:space="preserve">引用真实性审查</w:t>
+            </w:r>
+          </w:p>
+        </w:tc>
+        <w:tc>
+          <w:tcPr>
+            <w:tcW w:type="dxa" w:w="5360"/>
+            <w:tcBorders>
+              <w:top w:val="single" w:color="D6E0F2" w:sz="1"/>
+              <w:left w:val="single" w:color="D6E0F2" w:sz="1"/>
+              <w:bottom w:val="single" w:color="D6E0F2" w:sz="1"/>
+              <w:right w:val="single" w:color="D6E0F2" w:sz="1"/>
+            </w:tcBorders>
+            <w:shd w:fill="EEF2FA" w:val="clear"/>
+            <w:tcMar>
+              <w:top w:type="dxa" w:w="80"/>
+              <w:left w:type="dxa" w:w="120"/>
+              <w:bottom w:type="dxa" w:w="80"/>
+              <w:right w:type="dxa" w:w="120"/>
+            </w:tcMar>
+            <w:vAlign w:val="center"/>
+          </w:tcPr>
+          <w:p>
+            <w:pPr>
+              <w:spacing w:after="40" w:before="40"/>
+            </w:pPr>
+            <w:r>
+              <w:rPr>
+                <w:rFonts w:ascii="Arial" w:cs="Arial" w:eastAsia="Arial" w:hAnsi="Arial"/>
+                <w:b w:val="false"/>
+                <w:bCs w:val="false"/>
+                <w:color w:val="0A1628"/>
+                <w:sz w:val="20"/>
+                <w:szCs w:val="20"/>
+              </w:rPr>
+              <w:t xml:space="preserve">对所有 Agent 引用文献进行语义交叉验证，产出 A/B/C/D 引用质量评级（新增）</w:t>
+            </w:r>
+          </w:p>
+        </w:tc>
+      </w:tr>
+      <w:tr>
+        <w:tc>
+          <w:tcPr>
+            <w:tcW w:type="dxa" w:w="2200"/>
+            <w:tcBorders>
+              <w:top w:val="single" w:color="D6E0F2" w:sz="1"/>
+              <w:left w:val="single" w:color="D6E0F2" w:sz="1"/>
+              <w:bottom w:val="single" w:color="D6E0F2" w:sz="1"/>
+              <w:right w:val="single" w:color="D6E0F2" w:sz="1"/>
+            </w:tcBorders>
+            <w:shd w:fill="FFFFFF" w:val="clear"/>
+            <w:tcMar>
+              <w:top w:type="dxa" w:w="80"/>
+              <w:left w:type="dxa" w:w="120"/>
+              <w:bottom w:type="dxa" w:w="80"/>
+              <w:right w:type="dxa" w:w="120"/>
+            </w:tcMar>
+            <w:vAlign w:val="center"/>
+          </w:tcPr>
+          <w:p>
+            <w:pPr>
+              <w:spacing w:after="40" w:before="40"/>
+            </w:pPr>
+            <w:r>
+              <w:rPr>
+                <w:rFonts w:ascii="Arial" w:cs="Arial" w:eastAsia="Arial" w:hAnsi="Arial"/>
+                <w:b w:val="false"/>
+                <w:bCs w:val="false"/>
+                <w:color w:val="0A1628"/>
+                <w:sz w:val="20"/>
+                <w:szCs w:val="20"/>
+              </w:rPr>
               <w:t xml:space="preserve">Output Agent</w:t>
             </w:r>
           </w:p>
@@ -4189,7 +4617,7 @@
           <w:sz w:val="22"/>
           <w:szCs w:val="22"/>
         </w:rPr>
-        <w:t xml:space="preserve">每个 Agent 在发言末尾产出「给结构化 IR 的要点摘要」（IR Summary），专门面向 Group Summarizer。</w:t>
+        <w:t xml:space="preserve">Critique Agent 对所有轮次的讨论进行六维独立批判审查，产出风险评估报告（独立阶段，不参与辩论）。</w:t>
       </w:r>
     </w:p>
     <w:p>
@@ -4208,7 +4636,7 @@
           <w:sz w:val="22"/>
           <w:szCs w:val="22"/>
         </w:rPr>
-        <w:t xml:space="preserve">Group Summarizer 仅读取各 Agent IR 摘要（非完整发言），生成 StructuredIRV2 决策结构体。</w:t>
+        <w:t xml:space="preserve">每个 Agent 在发言末尾产出「给结构化 IR 的要点摘要」（IR Summary），专门面向 Group Summarizer。</w:t>
       </w:r>
     </w:p>
     <w:p>
@@ -4227,6 +4655,44 @@
           <w:sz w:val="22"/>
           <w:szCs w:val="22"/>
         </w:rPr>
+        <w:t xml:space="preserve">Group Summarizer 仅读取各 Agent IR 摘要（非完整发言），生成 StructuredIRV2 决策结构体。</w:t>
+      </w:r>
+    </w:p>
+    <w:p>
+      <w:pPr>
+        <w:pStyle w:val="ListParagraph"/>
+        <w:numPr>
+          <w:ilvl w:val="0"/>
+          <w:numId w:val="3"/>
+        </w:numPr>
+        <w:spacing w:after="40" w:before="40"/>
+      </w:pPr>
+      <w:r>
+        <w:rPr>
+          <w:rFonts w:ascii="Arial" w:cs="Arial" w:eastAsia="Arial" w:hAnsi="Arial"/>
+          <w:color w:val="0A1628"/>
+          <w:sz w:val="22"/>
+          <w:szCs w:val="22"/>
+        </w:rPr>
+        <w:t xml:space="preserve">Citation Review Agent 对所有辩论消息中的「### 外部引用」进行交叉验证，产出引用质量报告。</w:t>
+      </w:r>
+    </w:p>
+    <w:p>
+      <w:pPr>
+        <w:pStyle w:val="ListParagraph"/>
+        <w:numPr>
+          <w:ilvl w:val="0"/>
+          <w:numId w:val="3"/>
+        </w:numPr>
+        <w:spacing w:after="40" w:before="40"/>
+      </w:pPr>
+      <w:r>
+        <w:rPr>
+          <w:rFonts w:ascii="Arial" w:cs="Arial" w:eastAsia="Arial" w:hAnsi="Arial"/>
+          <w:color w:val="0A1628"/>
+          <w:sz w:val="22"/>
+          <w:szCs w:val="22"/>
+        </w:rPr>
         <w:t xml:space="preserve">Output Agent 综合 Briefing 摘要 + 压缩 IR + 讨论摘要，生成最终报告。</w:t>
       </w:r>
     </w:p>
@@ -4266,6 +4732,1523 @@
           <w:szCs w:val="22"/>
         </w:rPr>
         <w:t xml:space="preserve">传统 LLM 对话系统随轮次增加，上下文长度指数膨胀。K-Storm 通过「IR 摘要」机制将每轮发言压缩为固定格式的要点摘要（含关键主张、支撑依据、风险或反驳点、建议进入 IR），使 Group Summarizer 的输入长度恒定，不随轮次线性增长。这是系统支持 5 轮深度讨论的关键技术设计。</w:t>
+      </w:r>
+    </w:p>
+    <w:p>
+      <w:pPr>
+        <w:spacing w:after="80" w:before="0"/>
+      </w:pPr>
+    </w:p>
+    <w:p>
+      <w:pPr>
+        <w:pStyle w:val="Heading2"/>
+        <w:spacing w:after="120" w:before="240"/>
+      </w:pPr>
+      <w:r>
+        <w:rPr>
+          <w:rFonts w:ascii="Arial" w:cs="Arial" w:eastAsia="Arial" w:hAnsi="Arial"/>
+          <w:b/>
+          <w:bCs/>
+          <w:color w:val="0A1628"/>
+          <w:sz w:val="26"/>
+          <w:szCs w:val="26"/>
+        </w:rPr>
+        <w:t xml:space="preserve">4.4  Critique Agent — 六维独立批判阶段</w:t>
+      </w:r>
+    </w:p>
+    <w:p>
+      <w:pPr>
+        <w:spacing w:after="80" w:before="60"/>
+      </w:pPr>
+      <w:r>
+        <w:rPr>
+          <w:rFonts w:ascii="Arial" w:cs="Arial" w:eastAsia="Arial" w:hAnsi="Arial"/>
+          <w:b w:val="false"/>
+          <w:bCs w:val="false"/>
+          <w:color w:val="0A1628"/>
+          <w:sz w:val="22"/>
+          <w:szCs w:val="22"/>
+        </w:rPr>
+        <w:t xml:space="preserve">Critique Agent 是所有辩论轮次结束后独立执行的批判审查 Agent，不参与辩论，仅读取全部辩论记录进行多维度审查，产出独立的风险评估报告。这一设计避免了「评审意见影响辩论进程」的干扰，保证批判客观性。</w:t>
+      </w:r>
+    </w:p>
+    <w:p>
+      <w:pPr>
+        <w:spacing w:after="40" w:before="0"/>
+      </w:pPr>
+    </w:p>
+    <w:p>
+      <w:pPr>
+        <w:spacing w:after="80" w:before="60"/>
+      </w:pPr>
+      <w:r>
+        <w:rPr>
+          <w:rFonts w:ascii="Arial" w:cs="Arial" w:eastAsia="Arial" w:hAnsi="Arial"/>
+          <w:b w:val="false"/>
+          <w:bCs w:val="false"/>
+          <w:color w:val="0A1628"/>
+          <w:sz w:val="22"/>
+          <w:szCs w:val="22"/>
+        </w:rPr>
+        <w:t xml:space="preserve">六个审查维度：</w:t>
+      </w:r>
+    </w:p>
+    <w:p>
+      <w:pPr>
+        <w:spacing w:after="40" w:before="0"/>
+      </w:pPr>
+    </w:p>
+    <w:tbl>
+      <w:tblPr>
+        <w:tblW w:type="dxa" w:w="9360"/>
+        <w:tblBorders>
+          <w:top w:val="single" w:color="auto" w:sz="4"/>
+          <w:left w:val="single" w:color="auto" w:sz="4"/>
+          <w:bottom w:val="single" w:color="auto" w:sz="4"/>
+          <w:right w:val="single" w:color="auto" w:sz="4"/>
+          <w:insideH w:val="single" w:color="auto" w:sz="4"/>
+          <w:insideV w:val="single" w:color="auto" w:sz="4"/>
+        </w:tblBorders>
+      </w:tblPr>
+      <w:tblGrid>
+        <w:gridCol w:w="1800"/>
+        <w:gridCol w:w="2600"/>
+        <w:gridCol w:w="4960"/>
+      </w:tblGrid>
+      <w:tr>
+        <w:trPr>
+          <w:tblHeader/>
+        </w:trPr>
+        <w:tc>
+          <w:tcPr>
+            <w:tcW w:type="dxa" w:w="1800"/>
+            <w:tcBorders>
+              <w:top w:val="single" w:color="1A52B8" w:sz="1"/>
+              <w:left w:val="single" w:color="1A52B8" w:sz="1"/>
+              <w:bottom w:val="single" w:color="1A52B8" w:sz="1"/>
+              <w:right w:val="single" w:color="1A52B8" w:sz="1"/>
+            </w:tcBorders>
+            <w:shd w:fill="1A52B8" w:val="clear"/>
+            <w:tcMar>
+              <w:top w:type="dxa" w:w="80"/>
+              <w:left w:type="dxa" w:w="120"/>
+              <w:bottom w:type="dxa" w:w="80"/>
+              <w:right w:type="dxa" w:w="120"/>
+            </w:tcMar>
+            <w:vAlign w:val="center"/>
+          </w:tcPr>
+          <w:p>
+            <w:pPr>
+              <w:spacing w:after="40" w:before="40"/>
+            </w:pPr>
+            <w:r>
+              <w:rPr>
+                <w:rFonts w:ascii="Arial" w:cs="Arial" w:eastAsia="Arial" w:hAnsi="Arial"/>
+                <w:b/>
+                <w:bCs/>
+                <w:color w:val="FFFFFF"/>
+                <w:sz w:val="20"/>
+                <w:szCs w:val="20"/>
+              </w:rPr>
+              <w:t xml:space="preserve">维度</w:t>
+            </w:r>
+          </w:p>
+        </w:tc>
+        <w:tc>
+          <w:tcPr>
+            <w:tcW w:type="dxa" w:w="2600"/>
+            <w:tcBorders>
+              <w:top w:val="single" w:color="1A52B8" w:sz="1"/>
+              <w:left w:val="single" w:color="1A52B8" w:sz="1"/>
+              <w:bottom w:val="single" w:color="1A52B8" w:sz="1"/>
+              <w:right w:val="single" w:color="1A52B8" w:sz="1"/>
+            </w:tcBorders>
+            <w:shd w:fill="1A52B8" w:val="clear"/>
+            <w:tcMar>
+              <w:top w:type="dxa" w:w="80"/>
+              <w:left w:type="dxa" w:w="120"/>
+              <w:bottom w:type="dxa" w:w="80"/>
+              <w:right w:type="dxa" w:w="120"/>
+            </w:tcMar>
+            <w:vAlign w:val="center"/>
+          </w:tcPr>
+          <w:p>
+            <w:pPr>
+              <w:spacing w:after="40" w:before="40"/>
+            </w:pPr>
+            <w:r>
+              <w:rPr>
+                <w:rFonts w:ascii="Arial" w:cs="Arial" w:eastAsia="Arial" w:hAnsi="Arial"/>
+                <w:b/>
+                <w:bCs/>
+                <w:color w:val="FFFFFF"/>
+                <w:sz w:val="20"/>
+                <w:szCs w:val="20"/>
+              </w:rPr>
+              <w:t xml:space="preserve">审查重点</w:t>
+            </w:r>
+          </w:p>
+        </w:tc>
+        <w:tc>
+          <w:tcPr>
+            <w:tcW w:type="dxa" w:w="4960"/>
+            <w:tcBorders>
+              <w:top w:val="single" w:color="1A52B8" w:sz="1"/>
+              <w:left w:val="single" w:color="1A52B8" w:sz="1"/>
+              <w:bottom w:val="single" w:color="1A52B8" w:sz="1"/>
+              <w:right w:val="single" w:color="1A52B8" w:sz="1"/>
+            </w:tcBorders>
+            <w:shd w:fill="1A52B8" w:val="clear"/>
+            <w:tcMar>
+              <w:top w:type="dxa" w:w="80"/>
+              <w:left w:type="dxa" w:w="120"/>
+              <w:bottom w:type="dxa" w:w="80"/>
+              <w:right w:type="dxa" w:w="120"/>
+            </w:tcMar>
+            <w:vAlign w:val="center"/>
+          </w:tcPr>
+          <w:p>
+            <w:pPr>
+              <w:spacing w:after="40" w:before="40"/>
+            </w:pPr>
+            <w:r>
+              <w:rPr>
+                <w:rFonts w:ascii="Arial" w:cs="Arial" w:eastAsia="Arial" w:hAnsi="Arial"/>
+                <w:b/>
+                <w:bCs/>
+                <w:color w:val="FFFFFF"/>
+                <w:sz w:val="20"/>
+                <w:szCs w:val="20"/>
+              </w:rPr>
+              <w:t xml:space="preserve">输出格式</w:t>
+            </w:r>
+          </w:p>
+        </w:tc>
+      </w:tr>
+      <w:tr>
+        <w:tc>
+          <w:tcPr>
+            <w:tcW w:type="dxa" w:w="1800"/>
+            <w:tcBorders>
+              <w:top w:val="single" w:color="D6E0F2" w:sz="1"/>
+              <w:left w:val="single" w:color="D6E0F2" w:sz="1"/>
+              <w:bottom w:val="single" w:color="D6E0F2" w:sz="1"/>
+              <w:right w:val="single" w:color="D6E0F2" w:sz="1"/>
+            </w:tcBorders>
+            <w:shd w:fill="FFFFFF" w:val="clear"/>
+            <w:tcMar>
+              <w:top w:type="dxa" w:w="80"/>
+              <w:left w:type="dxa" w:w="120"/>
+              <w:bottom w:type="dxa" w:w="80"/>
+              <w:right w:type="dxa" w:w="120"/>
+            </w:tcMar>
+            <w:vAlign w:val="center"/>
+          </w:tcPr>
+          <w:p>
+            <w:pPr>
+              <w:spacing w:after="40" w:before="40"/>
+            </w:pPr>
+            <w:r>
+              <w:rPr>
+                <w:rFonts w:ascii="Arial" w:cs="Arial" w:eastAsia="Arial" w:hAnsi="Arial"/>
+                <w:b w:val="false"/>
+                <w:bCs w:val="false"/>
+                <w:color w:val="0A1628"/>
+                <w:sz w:val="20"/>
+                <w:szCs w:val="20"/>
+              </w:rPr>
+              <w:t xml:space="preserve">创新性风险</w:t>
+            </w:r>
+          </w:p>
+        </w:tc>
+        <w:tc>
+          <w:tcPr>
+            <w:tcW w:type="dxa" w:w="2600"/>
+            <w:tcBorders>
+              <w:top w:val="single" w:color="D6E0F2" w:sz="1"/>
+              <w:left w:val="single" w:color="D6E0F2" w:sz="1"/>
+              <w:bottom w:val="single" w:color="D6E0F2" w:sz="1"/>
+              <w:right w:val="single" w:color="D6E0F2" w:sz="1"/>
+            </w:tcBorders>
+            <w:shd w:fill="FFFFFF" w:val="clear"/>
+            <w:tcMar>
+              <w:top w:type="dxa" w:w="80"/>
+              <w:left w:type="dxa" w:w="120"/>
+              <w:bottom w:type="dxa" w:w="80"/>
+              <w:right w:type="dxa" w:w="120"/>
+            </w:tcMar>
+            <w:vAlign w:val="center"/>
+          </w:tcPr>
+          <w:p>
+            <w:pPr>
+              <w:spacing w:after="40" w:before="40"/>
+            </w:pPr>
+            <w:r>
+              <w:rPr>
+                <w:rFonts w:ascii="Arial" w:cs="Arial" w:eastAsia="Arial" w:hAnsi="Arial"/>
+                <w:b w:val="false"/>
+                <w:bCs w:val="false"/>
+                <w:color w:val="0A1628"/>
+                <w:sz w:val="20"/>
+                <w:szCs w:val="20"/>
+              </w:rPr>
+              <w:t xml:space="preserve">候选方向是否有真正差异化，是否存在换皮重复</w:t>
+            </w:r>
+          </w:p>
+        </w:tc>
+        <w:tc>
+          <w:tcPr>
+            <w:tcW w:type="dxa" w:w="4960"/>
+            <w:tcBorders>
+              <w:top w:val="single" w:color="D6E0F2" w:sz="1"/>
+              <w:left w:val="single" w:color="D6E0F2" w:sz="1"/>
+              <w:bottom w:val="single" w:color="D6E0F2" w:sz="1"/>
+              <w:right w:val="single" w:color="D6E0F2" w:sz="1"/>
+            </w:tcBorders>
+            <w:shd w:fill="FFFFFF" w:val="clear"/>
+            <w:tcMar>
+              <w:top w:type="dxa" w:w="80"/>
+              <w:left w:type="dxa" w:w="120"/>
+              <w:bottom w:type="dxa" w:w="80"/>
+              <w:right w:type="dxa" w:w="120"/>
+            </w:tcMar>
+            <w:vAlign w:val="center"/>
+          </w:tcPr>
+          <w:p>
+            <w:pPr>
+              <w:spacing w:after="40" w:before="40"/>
+            </w:pPr>
+            <w:r>
+              <w:rPr>
+                <w:rFonts w:ascii="Arial" w:cs="Arial" w:eastAsia="Arial" w:hAnsi="Arial"/>
+                <w:b w:val="false"/>
+                <w:bCs w:val="false"/>
+                <w:color w:val="0A1628"/>
+                <w:sz w:val="20"/>
+                <w:szCs w:val="20"/>
+              </w:rPr>
+              <w:t xml:space="preserve">风险等级（低/中/高）+ 具体问题 + 改进建议</w:t>
+            </w:r>
+          </w:p>
+        </w:tc>
+      </w:tr>
+      <w:tr>
+        <w:tc>
+          <w:tcPr>
+            <w:tcW w:type="dxa" w:w="1800"/>
+            <w:tcBorders>
+              <w:top w:val="single" w:color="D6E0F2" w:sz="1"/>
+              <w:left w:val="single" w:color="D6E0F2" w:sz="1"/>
+              <w:bottom w:val="single" w:color="D6E0F2" w:sz="1"/>
+              <w:right w:val="single" w:color="D6E0F2" w:sz="1"/>
+            </w:tcBorders>
+            <w:shd w:fill="EEF2FA" w:val="clear"/>
+            <w:tcMar>
+              <w:top w:type="dxa" w:w="80"/>
+              <w:left w:type="dxa" w:w="120"/>
+              <w:bottom w:type="dxa" w:w="80"/>
+              <w:right w:type="dxa" w:w="120"/>
+            </w:tcMar>
+            <w:vAlign w:val="center"/>
+          </w:tcPr>
+          <w:p>
+            <w:pPr>
+              <w:spacing w:after="40" w:before="40"/>
+            </w:pPr>
+            <w:r>
+              <w:rPr>
+                <w:rFonts w:ascii="Arial" w:cs="Arial" w:eastAsia="Arial" w:hAnsi="Arial"/>
+                <w:b w:val="false"/>
+                <w:bCs w:val="false"/>
+                <w:color w:val="0A1628"/>
+                <w:sz w:val="20"/>
+                <w:szCs w:val="20"/>
+              </w:rPr>
+              <w:t xml:space="preserve">证据链完整性</w:t>
+            </w:r>
+          </w:p>
+        </w:tc>
+        <w:tc>
+          <w:tcPr>
+            <w:tcW w:type="dxa" w:w="2600"/>
+            <w:tcBorders>
+              <w:top w:val="single" w:color="D6E0F2" w:sz="1"/>
+              <w:left w:val="single" w:color="D6E0F2" w:sz="1"/>
+              <w:bottom w:val="single" w:color="D6E0F2" w:sz="1"/>
+              <w:right w:val="single" w:color="D6E0F2" w:sz="1"/>
+            </w:tcBorders>
+            <w:shd w:fill="EEF2FA" w:val="clear"/>
+            <w:tcMar>
+              <w:top w:type="dxa" w:w="80"/>
+              <w:left w:type="dxa" w:w="120"/>
+              <w:bottom w:type="dxa" w:w="80"/>
+              <w:right w:type="dxa" w:w="120"/>
+            </w:tcMar>
+            <w:vAlign w:val="center"/>
+          </w:tcPr>
+          <w:p>
+            <w:pPr>
+              <w:spacing w:after="40" w:before="40"/>
+            </w:pPr>
+            <w:r>
+              <w:rPr>
+                <w:rFonts w:ascii="Arial" w:cs="Arial" w:eastAsia="Arial" w:hAnsi="Arial"/>
+                <w:b w:val="false"/>
+                <w:bCs w:val="false"/>
+                <w:color w:val="0A1628"/>
+                <w:sz w:val="20"/>
+                <w:szCs w:val="20"/>
+              </w:rPr>
+              <w:t xml:space="preserve">核心论点文献支撑是否充分，推理链条是否存在断点</w:t>
+            </w:r>
+          </w:p>
+        </w:tc>
+        <w:tc>
+          <w:tcPr>
+            <w:tcW w:type="dxa" w:w="4960"/>
+            <w:tcBorders>
+              <w:top w:val="single" w:color="D6E0F2" w:sz="1"/>
+              <w:left w:val="single" w:color="D6E0F2" w:sz="1"/>
+              <w:bottom w:val="single" w:color="D6E0F2" w:sz="1"/>
+              <w:right w:val="single" w:color="D6E0F2" w:sz="1"/>
+            </w:tcBorders>
+            <w:shd w:fill="EEF2FA" w:val="clear"/>
+            <w:tcMar>
+              <w:top w:type="dxa" w:w="80"/>
+              <w:left w:type="dxa" w:w="120"/>
+              <w:bottom w:type="dxa" w:w="80"/>
+              <w:right w:type="dxa" w:w="120"/>
+            </w:tcMar>
+            <w:vAlign w:val="center"/>
+          </w:tcPr>
+          <w:p>
+            <w:pPr>
+              <w:spacing w:after="40" w:before="40"/>
+            </w:pPr>
+            <w:r>
+              <w:rPr>
+                <w:rFonts w:ascii="Arial" w:cs="Arial" w:eastAsia="Arial" w:hAnsi="Arial"/>
+                <w:b w:val="false"/>
+                <w:bCs w:val="false"/>
+                <w:color w:val="0A1628"/>
+                <w:sz w:val="20"/>
+                <w:szCs w:val="20"/>
+              </w:rPr>
+              <w:t xml:space="preserve">风险等级 + 具体问题 + 改进建议</w:t>
+            </w:r>
+          </w:p>
+        </w:tc>
+      </w:tr>
+      <w:tr>
+        <w:tc>
+          <w:tcPr>
+            <w:tcW w:type="dxa" w:w="1800"/>
+            <w:tcBorders>
+              <w:top w:val="single" w:color="D6E0F2" w:sz="1"/>
+              <w:left w:val="single" w:color="D6E0F2" w:sz="1"/>
+              <w:bottom w:val="single" w:color="D6E0F2" w:sz="1"/>
+              <w:right w:val="single" w:color="D6E0F2" w:sz="1"/>
+            </w:tcBorders>
+            <w:shd w:fill="FFFFFF" w:val="clear"/>
+            <w:tcMar>
+              <w:top w:type="dxa" w:w="80"/>
+              <w:left w:type="dxa" w:w="120"/>
+              <w:bottom w:type="dxa" w:w="80"/>
+              <w:right w:type="dxa" w:w="120"/>
+            </w:tcMar>
+            <w:vAlign w:val="center"/>
+          </w:tcPr>
+          <w:p>
+            <w:pPr>
+              <w:spacing w:after="40" w:before="40"/>
+            </w:pPr>
+            <w:r>
+              <w:rPr>
+                <w:rFonts w:ascii="Arial" w:cs="Arial" w:eastAsia="Arial" w:hAnsi="Arial"/>
+                <w:b w:val="false"/>
+                <w:bCs w:val="false"/>
+                <w:color w:val="0A1628"/>
+                <w:sz w:val="20"/>
+                <w:szCs w:val="20"/>
+              </w:rPr>
+              <w:t xml:space="preserve">可行性盲点</w:t>
+            </w:r>
+          </w:p>
+        </w:tc>
+        <w:tc>
+          <w:tcPr>
+            <w:tcW w:type="dxa" w:w="2600"/>
+            <w:tcBorders>
+              <w:top w:val="single" w:color="D6E0F2" w:sz="1"/>
+              <w:left w:val="single" w:color="D6E0F2" w:sz="1"/>
+              <w:bottom w:val="single" w:color="D6E0F2" w:sz="1"/>
+              <w:right w:val="single" w:color="D6E0F2" w:sz="1"/>
+            </w:tcBorders>
+            <w:shd w:fill="FFFFFF" w:val="clear"/>
+            <w:tcMar>
+              <w:top w:type="dxa" w:w="80"/>
+              <w:left w:type="dxa" w:w="120"/>
+              <w:bottom w:type="dxa" w:w="80"/>
+              <w:right w:type="dxa" w:w="120"/>
+            </w:tcMar>
+            <w:vAlign w:val="center"/>
+          </w:tcPr>
+          <w:p>
+            <w:pPr>
+              <w:spacing w:after="40" w:before="40"/>
+            </w:pPr>
+            <w:r>
+              <w:rPr>
+                <w:rFonts w:ascii="Arial" w:cs="Arial" w:eastAsia="Arial" w:hAnsi="Arial"/>
+                <w:b w:val="false"/>
+                <w:bCs w:val="false"/>
+                <w:color w:val="0A1628"/>
+                <w:sz w:val="20"/>
+                <w:szCs w:val="20"/>
+              </w:rPr>
+              <w:t xml:space="preserve">可行性评估是否遗漏关键资源约束或技术瓶颈</w:t>
+            </w:r>
+          </w:p>
+        </w:tc>
+        <w:tc>
+          <w:tcPr>
+            <w:tcW w:type="dxa" w:w="4960"/>
+            <w:tcBorders>
+              <w:top w:val="single" w:color="D6E0F2" w:sz="1"/>
+              <w:left w:val="single" w:color="D6E0F2" w:sz="1"/>
+              <w:bottom w:val="single" w:color="D6E0F2" w:sz="1"/>
+              <w:right w:val="single" w:color="D6E0F2" w:sz="1"/>
+            </w:tcBorders>
+            <w:shd w:fill="FFFFFF" w:val="clear"/>
+            <w:tcMar>
+              <w:top w:type="dxa" w:w="80"/>
+              <w:left w:type="dxa" w:w="120"/>
+              <w:bottom w:type="dxa" w:w="80"/>
+              <w:right w:type="dxa" w:w="120"/>
+            </w:tcMar>
+            <w:vAlign w:val="center"/>
+          </w:tcPr>
+          <w:p>
+            <w:pPr>
+              <w:spacing w:after="40" w:before="40"/>
+            </w:pPr>
+            <w:r>
+              <w:rPr>
+                <w:rFonts w:ascii="Arial" w:cs="Arial" w:eastAsia="Arial" w:hAnsi="Arial"/>
+                <w:b w:val="false"/>
+                <w:bCs w:val="false"/>
+                <w:color w:val="0A1628"/>
+                <w:sz w:val="20"/>
+                <w:szCs w:val="20"/>
+              </w:rPr>
+              <w:t xml:space="preserve">风险等级 + 具体问题 + 改进建议</w:t>
+            </w:r>
+          </w:p>
+        </w:tc>
+      </w:tr>
+      <w:tr>
+        <w:tc>
+          <w:tcPr>
+            <w:tcW w:type="dxa" w:w="1800"/>
+            <w:tcBorders>
+              <w:top w:val="single" w:color="D6E0F2" w:sz="1"/>
+              <w:left w:val="single" w:color="D6E0F2" w:sz="1"/>
+              <w:bottom w:val="single" w:color="D6E0F2" w:sz="1"/>
+              <w:right w:val="single" w:color="D6E0F2" w:sz="1"/>
+            </w:tcBorders>
+            <w:shd w:fill="EEF2FA" w:val="clear"/>
+            <w:tcMar>
+              <w:top w:type="dxa" w:w="80"/>
+              <w:left w:type="dxa" w:w="120"/>
+              <w:bottom w:type="dxa" w:w="80"/>
+              <w:right w:type="dxa" w:w="120"/>
+            </w:tcMar>
+            <w:vAlign w:val="center"/>
+          </w:tcPr>
+          <w:p>
+            <w:pPr>
+              <w:spacing w:after="40" w:before="40"/>
+            </w:pPr>
+            <w:r>
+              <w:rPr>
+                <w:rFonts w:ascii="Arial" w:cs="Arial" w:eastAsia="Arial" w:hAnsi="Arial"/>
+                <w:b w:val="false"/>
+                <w:bCs w:val="false"/>
+                <w:color w:val="0A1628"/>
+                <w:sz w:val="20"/>
+                <w:szCs w:val="20"/>
+              </w:rPr>
+              <w:t xml:space="preserve">逻辑一致性</w:t>
+            </w:r>
+          </w:p>
+        </w:tc>
+        <w:tc>
+          <w:tcPr>
+            <w:tcW w:type="dxa" w:w="2600"/>
+            <w:tcBorders>
+              <w:top w:val="single" w:color="D6E0F2" w:sz="1"/>
+              <w:left w:val="single" w:color="D6E0F2" w:sz="1"/>
+              <w:bottom w:val="single" w:color="D6E0F2" w:sz="1"/>
+              <w:right w:val="single" w:color="D6E0F2" w:sz="1"/>
+            </w:tcBorders>
+            <w:shd w:fill="EEF2FA" w:val="clear"/>
+            <w:tcMar>
+              <w:top w:type="dxa" w:w="80"/>
+              <w:left w:type="dxa" w:w="120"/>
+              <w:bottom w:type="dxa" w:w="80"/>
+              <w:right w:type="dxa" w:w="120"/>
+            </w:tcMar>
+            <w:vAlign w:val="center"/>
+          </w:tcPr>
+          <w:p>
+            <w:pPr>
+              <w:spacing w:after="40" w:before="40"/>
+            </w:pPr>
+            <w:r>
+              <w:rPr>
+                <w:rFonts w:ascii="Arial" w:cs="Arial" w:eastAsia="Arial" w:hAnsi="Arial"/>
+                <w:b w:val="false"/>
+                <w:bCs w:val="false"/>
+                <w:color w:val="0A1628"/>
+                <w:sz w:val="20"/>
+                <w:szCs w:val="20"/>
+              </w:rPr>
+              <w:t xml:space="preserve">各 Agent 发言间是否存在 Moderator 未捕捉的隐性矛盾</w:t>
+            </w:r>
+          </w:p>
+        </w:tc>
+        <w:tc>
+          <w:tcPr>
+            <w:tcW w:type="dxa" w:w="4960"/>
+            <w:tcBorders>
+              <w:top w:val="single" w:color="D6E0F2" w:sz="1"/>
+              <w:left w:val="single" w:color="D6E0F2" w:sz="1"/>
+              <w:bottom w:val="single" w:color="D6E0F2" w:sz="1"/>
+              <w:right w:val="single" w:color="D6E0F2" w:sz="1"/>
+            </w:tcBorders>
+            <w:shd w:fill="EEF2FA" w:val="clear"/>
+            <w:tcMar>
+              <w:top w:type="dxa" w:w="80"/>
+              <w:left w:type="dxa" w:w="120"/>
+              <w:bottom w:type="dxa" w:w="80"/>
+              <w:right w:type="dxa" w:w="120"/>
+            </w:tcMar>
+            <w:vAlign w:val="center"/>
+          </w:tcPr>
+          <w:p>
+            <w:pPr>
+              <w:spacing w:after="40" w:before="40"/>
+            </w:pPr>
+            <w:r>
+              <w:rPr>
+                <w:rFonts w:ascii="Arial" w:cs="Arial" w:eastAsia="Arial" w:hAnsi="Arial"/>
+                <w:b w:val="false"/>
+                <w:bCs w:val="false"/>
+                <w:color w:val="0A1628"/>
+                <w:sz w:val="20"/>
+                <w:szCs w:val="20"/>
+              </w:rPr>
+              <w:t xml:space="preserve">风险等级 + 具体问题 + 改进建议</w:t>
+            </w:r>
+          </w:p>
+        </w:tc>
+      </w:tr>
+      <w:tr>
+        <w:tc>
+          <w:tcPr>
+            <w:tcW w:type="dxa" w:w="1800"/>
+            <w:tcBorders>
+              <w:top w:val="single" w:color="D6E0F2" w:sz="1"/>
+              <w:left w:val="single" w:color="D6E0F2" w:sz="1"/>
+              <w:bottom w:val="single" w:color="D6E0F2" w:sz="1"/>
+              <w:right w:val="single" w:color="D6E0F2" w:sz="1"/>
+            </w:tcBorders>
+            <w:shd w:fill="FFFFFF" w:val="clear"/>
+            <w:tcMar>
+              <w:top w:type="dxa" w:w="80"/>
+              <w:left w:type="dxa" w:w="120"/>
+              <w:bottom w:type="dxa" w:w="80"/>
+              <w:right w:type="dxa" w:w="120"/>
+            </w:tcMar>
+            <w:vAlign w:val="center"/>
+          </w:tcPr>
+          <w:p>
+            <w:pPr>
+              <w:spacing w:after="40" w:before="40"/>
+            </w:pPr>
+            <w:r>
+              <w:rPr>
+                <w:rFonts w:ascii="Arial" w:cs="Arial" w:eastAsia="Arial" w:hAnsi="Arial"/>
+                <w:b w:val="false"/>
+                <w:bCs w:val="false"/>
+                <w:color w:val="0A1628"/>
+                <w:sz w:val="20"/>
+                <w:szCs w:val="20"/>
+              </w:rPr>
+              <w:t xml:space="preserve">偏见与盲区</w:t>
+            </w:r>
+          </w:p>
+        </w:tc>
+        <w:tc>
+          <w:tcPr>
+            <w:tcW w:type="dxa" w:w="2600"/>
+            <w:tcBorders>
+              <w:top w:val="single" w:color="D6E0F2" w:sz="1"/>
+              <w:left w:val="single" w:color="D6E0F2" w:sz="1"/>
+              <w:bottom w:val="single" w:color="D6E0F2" w:sz="1"/>
+              <w:right w:val="single" w:color="D6E0F2" w:sz="1"/>
+            </w:tcBorders>
+            <w:shd w:fill="FFFFFF" w:val="clear"/>
+            <w:tcMar>
+              <w:top w:type="dxa" w:w="80"/>
+              <w:left w:type="dxa" w:w="120"/>
+              <w:bottom w:type="dxa" w:w="80"/>
+              <w:right w:type="dxa" w:w="120"/>
+            </w:tcMar>
+            <w:vAlign w:val="center"/>
+          </w:tcPr>
+          <w:p>
+            <w:pPr>
+              <w:spacing w:after="40" w:before="40"/>
+            </w:pPr>
+            <w:r>
+              <w:rPr>
+                <w:rFonts w:ascii="Arial" w:cs="Arial" w:eastAsia="Arial" w:hAnsi="Arial"/>
+                <w:b w:val="false"/>
+                <w:bCs w:val="false"/>
+                <w:color w:val="0A1628"/>
+                <w:sz w:val="20"/>
+                <w:szCs w:val="20"/>
+              </w:rPr>
+              <w:t xml:space="preserve">讨论组是否存在视角同质化或对某类方法的系统性忽视</w:t>
+            </w:r>
+          </w:p>
+        </w:tc>
+        <w:tc>
+          <w:tcPr>
+            <w:tcW w:type="dxa" w:w="4960"/>
+            <w:tcBorders>
+              <w:top w:val="single" w:color="D6E0F2" w:sz="1"/>
+              <w:left w:val="single" w:color="D6E0F2" w:sz="1"/>
+              <w:bottom w:val="single" w:color="D6E0F2" w:sz="1"/>
+              <w:right w:val="single" w:color="D6E0F2" w:sz="1"/>
+            </w:tcBorders>
+            <w:shd w:fill="FFFFFF" w:val="clear"/>
+            <w:tcMar>
+              <w:top w:type="dxa" w:w="80"/>
+              <w:left w:type="dxa" w:w="120"/>
+              <w:bottom w:type="dxa" w:w="80"/>
+              <w:right w:type="dxa" w:w="120"/>
+            </w:tcMar>
+            <w:vAlign w:val="center"/>
+          </w:tcPr>
+          <w:p>
+            <w:pPr>
+              <w:spacing w:after="40" w:before="40"/>
+            </w:pPr>
+            <w:r>
+              <w:rPr>
+                <w:rFonts w:ascii="Arial" w:cs="Arial" w:eastAsia="Arial" w:hAnsi="Arial"/>
+                <w:b w:val="false"/>
+                <w:bCs w:val="false"/>
+                <w:color w:val="0A1628"/>
+                <w:sz w:val="20"/>
+                <w:szCs w:val="20"/>
+              </w:rPr>
+              <w:t xml:space="preserve">风险等级 + 具体问题 + 改进建议</w:t>
+            </w:r>
+          </w:p>
+        </w:tc>
+      </w:tr>
+      <w:tr>
+        <w:tc>
+          <w:tcPr>
+            <w:tcW w:type="dxa" w:w="1800"/>
+            <w:tcBorders>
+              <w:top w:val="single" w:color="D6E0F2" w:sz="1"/>
+              <w:left w:val="single" w:color="D6E0F2" w:sz="1"/>
+              <w:bottom w:val="single" w:color="D6E0F2" w:sz="1"/>
+              <w:right w:val="single" w:color="D6E0F2" w:sz="1"/>
+            </w:tcBorders>
+            <w:shd w:fill="EEF2FA" w:val="clear"/>
+            <w:tcMar>
+              <w:top w:type="dxa" w:w="80"/>
+              <w:left w:type="dxa" w:w="120"/>
+              <w:bottom w:type="dxa" w:w="80"/>
+              <w:right w:type="dxa" w:w="120"/>
+            </w:tcMar>
+            <w:vAlign w:val="center"/>
+          </w:tcPr>
+          <w:p>
+            <w:pPr>
+              <w:spacing w:after="40" w:before="40"/>
+            </w:pPr>
+            <w:r>
+              <w:rPr>
+                <w:rFonts w:ascii="Arial" w:cs="Arial" w:eastAsia="Arial" w:hAnsi="Arial"/>
+                <w:b w:val="false"/>
+                <w:bCs w:val="false"/>
+                <w:color w:val="0A1628"/>
+                <w:sz w:val="20"/>
+                <w:szCs w:val="20"/>
+              </w:rPr>
+              <w:t xml:space="preserve">下一步风险</w:t>
+            </w:r>
+          </w:p>
+        </w:tc>
+        <w:tc>
+          <w:tcPr>
+            <w:tcW w:type="dxa" w:w="2600"/>
+            <w:tcBorders>
+              <w:top w:val="single" w:color="D6E0F2" w:sz="1"/>
+              <w:left w:val="single" w:color="D6E0F2" w:sz="1"/>
+              <w:bottom w:val="single" w:color="D6E0F2" w:sz="1"/>
+              <w:right w:val="single" w:color="D6E0F2" w:sz="1"/>
+            </w:tcBorders>
+            <w:shd w:fill="EEF2FA" w:val="clear"/>
+            <w:tcMar>
+              <w:top w:type="dxa" w:w="80"/>
+              <w:left w:type="dxa" w:w="120"/>
+              <w:bottom w:type="dxa" w:w="80"/>
+              <w:right w:type="dxa" w:w="120"/>
+            </w:tcMar>
+            <w:vAlign w:val="center"/>
+          </w:tcPr>
+          <w:p>
+            <w:pPr>
+              <w:spacing w:after="40" w:before="40"/>
+            </w:pPr>
+            <w:r>
+              <w:rPr>
+                <w:rFonts w:ascii="Arial" w:cs="Arial" w:eastAsia="Arial" w:hAnsi="Arial"/>
+                <w:b w:val="false"/>
+                <w:bCs w:val="false"/>
+                <w:color w:val="0A1628"/>
+                <w:sz w:val="20"/>
+                <w:szCs w:val="20"/>
+              </w:rPr>
+              <w:t xml:space="preserve">最终行动路径中哪些步骤潜藏最高风险</w:t>
+            </w:r>
+          </w:p>
+        </w:tc>
+        <w:tc>
+          <w:tcPr>
+            <w:tcW w:type="dxa" w:w="4960"/>
+            <w:tcBorders>
+              <w:top w:val="single" w:color="D6E0F2" w:sz="1"/>
+              <w:left w:val="single" w:color="D6E0F2" w:sz="1"/>
+              <w:bottom w:val="single" w:color="D6E0F2" w:sz="1"/>
+              <w:right w:val="single" w:color="D6E0F2" w:sz="1"/>
+            </w:tcBorders>
+            <w:shd w:fill="EEF2FA" w:val="clear"/>
+            <w:tcMar>
+              <w:top w:type="dxa" w:w="80"/>
+              <w:left w:type="dxa" w:w="120"/>
+              <w:bottom w:type="dxa" w:w="80"/>
+              <w:right w:type="dxa" w:w="120"/>
+            </w:tcMar>
+            <w:vAlign w:val="center"/>
+          </w:tcPr>
+          <w:p>
+            <w:pPr>
+              <w:spacing w:after="40" w:before="40"/>
+            </w:pPr>
+            <w:r>
+              <w:rPr>
+                <w:rFonts w:ascii="Arial" w:cs="Arial" w:eastAsia="Arial" w:hAnsi="Arial"/>
+                <w:b w:val="false"/>
+                <w:bCs w:val="false"/>
+                <w:color w:val="0A1628"/>
+                <w:sz w:val="20"/>
+                <w:szCs w:val="20"/>
+              </w:rPr>
+              <w:t xml:space="preserve">风险等级 + 具体问题 + 改进建议</w:t>
+            </w:r>
+          </w:p>
+        </w:tc>
+      </w:tr>
+    </w:tbl>
+    <w:p>
+      <w:pPr>
+        <w:spacing w:after="40" w:before="0"/>
+      </w:pPr>
+    </w:p>
+    <w:p>
+      <w:pPr>
+        <w:spacing w:after="80" w:before="60"/>
+      </w:pPr>
+      <w:r>
+        <w:rPr>
+          <w:rFonts w:ascii="Arial" w:cs="Arial" w:eastAsia="Arial" w:hAnsi="Arial"/>
+          <w:b w:val="false"/>
+          <w:bCs w:val="false"/>
+          <w:color w:val="0A1628"/>
+          <w:sz w:val="22"/>
+          <w:szCs w:val="22"/>
+        </w:rPr>
+        <w:t xml:space="preserve">最终输出「综合风险等级（低/中/高）」和「最值得关注的 Top-3 风险」。前端以玫红色（#B03050）边框卡片展示批判报告，与辩论卡片视觉区分。</w:t>
+      </w:r>
+    </w:p>
+    <w:p>
+      <w:pPr>
+        <w:spacing w:after="80" w:before="0"/>
+      </w:pPr>
+    </w:p>
+    <w:p>
+      <w:pPr>
+        <w:pStyle w:val="Heading2"/>
+        <w:spacing w:after="120" w:before="240"/>
+      </w:pPr>
+      <w:r>
+        <w:rPr>
+          <w:rFonts w:ascii="Arial" w:cs="Arial" w:eastAsia="Arial" w:hAnsi="Arial"/>
+          <w:b/>
+          <w:bCs/>
+          <w:color w:val="0A1628"/>
+          <w:sz w:val="26"/>
+          <w:szCs w:val="26"/>
+        </w:rPr>
+        <w:t xml:space="preserve">4.5  Citation Review Agent — 引用真实性交叉验证</w:t>
+      </w:r>
+    </w:p>
+    <w:p>
+      <w:pPr>
+        <w:spacing w:after="80" w:before="60"/>
+      </w:pPr>
+      <w:r>
+        <w:rPr>
+          <w:rFonts w:ascii="Arial" w:cs="Arial" w:eastAsia="Arial" w:hAnsi="Arial"/>
+          <w:b w:val="false"/>
+          <w:bCs w:val="false"/>
+          <w:color w:val="0A1628"/>
+          <w:sz w:val="22"/>
+          <w:szCs w:val="22"/>
+        </w:rPr>
+        <w:t xml:space="preserve">Citation Review Agent 在 Group Summarizer 之后执行，专门针对所有辩论消息中的「### 外部引用」小节进行交叉语义验证。这是对讨论质量的第二道独立校验，防止 Agent 使用不相关或无法追溯的文献支撑论点。</w:t>
+      </w:r>
+    </w:p>
+    <w:p>
+      <w:pPr>
+        <w:spacing w:after="40" w:before="0"/>
+      </w:pPr>
+    </w:p>
+    <w:p>
+      <w:pPr>
+        <w:spacing w:after="80" w:before="60"/>
+      </w:pPr>
+      <w:r>
+        <w:rPr>
+          <w:rFonts w:ascii="Arial" w:cs="Arial" w:eastAsia="Arial" w:hAnsi="Arial"/>
+          <w:b w:val="false"/>
+          <w:bCs w:val="false"/>
+          <w:color w:val="0A1628"/>
+          <w:sz w:val="22"/>
+          <w:szCs w:val="22"/>
+        </w:rPr>
+        <w:t xml:space="preserve">四个审查维度：</w:t>
+      </w:r>
+    </w:p>
+    <w:p>
+      <w:pPr>
+        <w:spacing w:after="40" w:before="0"/>
+      </w:pPr>
+    </w:p>
+    <w:tbl>
+      <w:tblPr>
+        <w:tblW w:type="dxa" w:w="9360"/>
+        <w:tblBorders>
+          <w:top w:val="single" w:color="auto" w:sz="4"/>
+          <w:left w:val="single" w:color="auto" w:sz="4"/>
+          <w:bottom w:val="single" w:color="auto" w:sz="4"/>
+          <w:right w:val="single" w:color="auto" w:sz="4"/>
+          <w:insideH w:val="single" w:color="auto" w:sz="4"/>
+          <w:insideV w:val="single" w:color="auto" w:sz="4"/>
+        </w:tblBorders>
+      </w:tblPr>
+      <w:tblGrid>
+        <w:gridCol w:w="2000"/>
+        <w:gridCol w:w="3160"/>
+        <w:gridCol w:w="4200"/>
+      </w:tblGrid>
+      <w:tr>
+        <w:trPr>
+          <w:tblHeader/>
+        </w:trPr>
+        <w:tc>
+          <w:tcPr>
+            <w:tcW w:type="dxa" w:w="2000"/>
+            <w:tcBorders>
+              <w:top w:val="single" w:color="1A52B8" w:sz="1"/>
+              <w:left w:val="single" w:color="1A52B8" w:sz="1"/>
+              <w:bottom w:val="single" w:color="1A52B8" w:sz="1"/>
+              <w:right w:val="single" w:color="1A52B8" w:sz="1"/>
+            </w:tcBorders>
+            <w:shd w:fill="1A52B8" w:val="clear"/>
+            <w:tcMar>
+              <w:top w:type="dxa" w:w="80"/>
+              <w:left w:type="dxa" w:w="120"/>
+              <w:bottom w:type="dxa" w:w="80"/>
+              <w:right w:type="dxa" w:w="120"/>
+            </w:tcMar>
+            <w:vAlign w:val="center"/>
+          </w:tcPr>
+          <w:p>
+            <w:pPr>
+              <w:spacing w:after="40" w:before="40"/>
+            </w:pPr>
+            <w:r>
+              <w:rPr>
+                <w:rFonts w:ascii="Arial" w:cs="Arial" w:eastAsia="Arial" w:hAnsi="Arial"/>
+                <w:b/>
+                <w:bCs/>
+                <w:color w:val="FFFFFF"/>
+                <w:sz w:val="20"/>
+                <w:szCs w:val="20"/>
+              </w:rPr>
+              <w:t xml:space="preserve">维度</w:t>
+            </w:r>
+          </w:p>
+        </w:tc>
+        <w:tc>
+          <w:tcPr>
+            <w:tcW w:type="dxa" w:w="3160"/>
+            <w:tcBorders>
+              <w:top w:val="single" w:color="1A52B8" w:sz="1"/>
+              <w:left w:val="single" w:color="1A52B8" w:sz="1"/>
+              <w:bottom w:val="single" w:color="1A52B8" w:sz="1"/>
+              <w:right w:val="single" w:color="1A52B8" w:sz="1"/>
+            </w:tcBorders>
+            <w:shd w:fill="1A52B8" w:val="clear"/>
+            <w:tcMar>
+              <w:top w:type="dxa" w:w="80"/>
+              <w:left w:type="dxa" w:w="120"/>
+              <w:bottom w:type="dxa" w:w="80"/>
+              <w:right w:type="dxa" w:w="120"/>
+            </w:tcMar>
+            <w:vAlign w:val="center"/>
+          </w:tcPr>
+          <w:p>
+            <w:pPr>
+              <w:spacing w:after="40" w:before="40"/>
+            </w:pPr>
+            <w:r>
+              <w:rPr>
+                <w:rFonts w:ascii="Arial" w:cs="Arial" w:eastAsia="Arial" w:hAnsi="Arial"/>
+                <w:b/>
+                <w:bCs/>
+                <w:color w:val="FFFFFF"/>
+                <w:sz w:val="20"/>
+                <w:szCs w:val="20"/>
+              </w:rPr>
+              <w:t xml:space="preserve">审查重点</w:t>
+            </w:r>
+          </w:p>
+        </w:tc>
+        <w:tc>
+          <w:tcPr>
+            <w:tcW w:type="dxa" w:w="4200"/>
+            <w:tcBorders>
+              <w:top w:val="single" w:color="1A52B8" w:sz="1"/>
+              <w:left w:val="single" w:color="1A52B8" w:sz="1"/>
+              <w:bottom w:val="single" w:color="1A52B8" w:sz="1"/>
+              <w:right w:val="single" w:color="1A52B8" w:sz="1"/>
+            </w:tcBorders>
+            <w:shd w:fill="1A52B8" w:val="clear"/>
+            <w:tcMar>
+              <w:top w:type="dxa" w:w="80"/>
+              <w:left w:type="dxa" w:w="120"/>
+              <w:bottom w:type="dxa" w:w="80"/>
+              <w:right w:type="dxa" w:w="120"/>
+            </w:tcMar>
+            <w:vAlign w:val="center"/>
+          </w:tcPr>
+          <w:p>
+            <w:pPr>
+              <w:spacing w:after="40" w:before="40"/>
+            </w:pPr>
+            <w:r>
+              <w:rPr>
+                <w:rFonts w:ascii="Arial" w:cs="Arial" w:eastAsia="Arial" w:hAnsi="Arial"/>
+                <w:b/>
+                <w:bCs/>
+                <w:color w:val="FFFFFF"/>
+                <w:sz w:val="20"/>
+                <w:szCs w:val="20"/>
+              </w:rPr>
+              <w:t xml:space="preserve">输出格式</w:t>
+            </w:r>
+          </w:p>
+        </w:tc>
+      </w:tr>
+      <w:tr>
+        <w:tc>
+          <w:tcPr>
+            <w:tcW w:type="dxa" w:w="2000"/>
+            <w:tcBorders>
+              <w:top w:val="single" w:color="D6E0F2" w:sz="1"/>
+              <w:left w:val="single" w:color="D6E0F2" w:sz="1"/>
+              <w:bottom w:val="single" w:color="D6E0F2" w:sz="1"/>
+              <w:right w:val="single" w:color="D6E0F2" w:sz="1"/>
+            </w:tcBorders>
+            <w:shd w:fill="FFFFFF" w:val="clear"/>
+            <w:tcMar>
+              <w:top w:type="dxa" w:w="80"/>
+              <w:left w:type="dxa" w:w="120"/>
+              <w:bottom w:type="dxa" w:w="80"/>
+              <w:right w:type="dxa" w:w="120"/>
+            </w:tcMar>
+            <w:vAlign w:val="center"/>
+          </w:tcPr>
+          <w:p>
+            <w:pPr>
+              <w:spacing w:after="40" w:before="40"/>
+            </w:pPr>
+            <w:r>
+              <w:rPr>
+                <w:rFonts w:ascii="Arial" w:cs="Arial" w:eastAsia="Arial" w:hAnsi="Arial"/>
+                <w:b w:val="false"/>
+                <w:bCs w:val="false"/>
+                <w:color w:val="0A1628"/>
+                <w:sz w:val="20"/>
+                <w:szCs w:val="20"/>
+              </w:rPr>
+              <w:t xml:space="preserve">引用相关性</w:t>
+            </w:r>
+          </w:p>
+        </w:tc>
+        <w:tc>
+          <w:tcPr>
+            <w:tcW w:type="dxa" w:w="3160"/>
+            <w:tcBorders>
+              <w:top w:val="single" w:color="D6E0F2" w:sz="1"/>
+              <w:left w:val="single" w:color="D6E0F2" w:sz="1"/>
+              <w:bottom w:val="single" w:color="D6E0F2" w:sz="1"/>
+              <w:right w:val="single" w:color="D6E0F2" w:sz="1"/>
+            </w:tcBorders>
+            <w:shd w:fill="FFFFFF" w:val="clear"/>
+            <w:tcMar>
+              <w:top w:type="dxa" w:w="80"/>
+              <w:left w:type="dxa" w:w="120"/>
+              <w:bottom w:type="dxa" w:w="80"/>
+              <w:right w:type="dxa" w:w="120"/>
+            </w:tcMar>
+            <w:vAlign w:val="center"/>
+          </w:tcPr>
+          <w:p>
+            <w:pPr>
+              <w:spacing w:after="40" w:before="40"/>
+            </w:pPr>
+            <w:r>
+              <w:rPr>
+                <w:rFonts w:ascii="Arial" w:cs="Arial" w:eastAsia="Arial" w:hAnsi="Arial"/>
+                <w:b w:val="false"/>
+                <w:bCs w:val="false"/>
+                <w:color w:val="0A1628"/>
+                <w:sz w:val="20"/>
+                <w:szCs w:val="20"/>
+              </w:rPr>
+              <w:t xml:space="preserve">每条引用是否与引用方论点直接相关，是否存在引用偏题</w:t>
+            </w:r>
+          </w:p>
+        </w:tc>
+        <w:tc>
+          <w:tcPr>
+            <w:tcW w:type="dxa" w:w="4200"/>
+            <w:tcBorders>
+              <w:top w:val="single" w:color="D6E0F2" w:sz="1"/>
+              <w:left w:val="single" w:color="D6E0F2" w:sz="1"/>
+              <w:bottom w:val="single" w:color="D6E0F2" w:sz="1"/>
+              <w:right w:val="single" w:color="D6E0F2" w:sz="1"/>
+            </w:tcBorders>
+            <w:shd w:fill="FFFFFF" w:val="clear"/>
+            <w:tcMar>
+              <w:top w:type="dxa" w:w="80"/>
+              <w:left w:type="dxa" w:w="120"/>
+              <w:bottom w:type="dxa" w:w="80"/>
+              <w:right w:type="dxa" w:w="120"/>
+            </w:tcMar>
+            <w:vAlign w:val="center"/>
+          </w:tcPr>
+          <w:p>
+            <w:pPr>
+              <w:spacing w:after="40" w:before="40"/>
+            </w:pPr>
+            <w:r>
+              <w:rPr>
+                <w:rFonts w:ascii="Arial" w:cs="Arial" w:eastAsia="Arial" w:hAnsi="Arial"/>
+                <w:b w:val="false"/>
+                <w:bCs w:val="false"/>
+                <w:color w:val="0A1628"/>
+                <w:sz w:val="20"/>
+                <w:szCs w:val="20"/>
+              </w:rPr>
+              <w:t xml:space="preserve">可信度评分（高/中/低/存疑）</w:t>
+            </w:r>
+          </w:p>
+        </w:tc>
+      </w:tr>
+      <w:tr>
+        <w:tc>
+          <w:tcPr>
+            <w:tcW w:type="dxa" w:w="2000"/>
+            <w:tcBorders>
+              <w:top w:val="single" w:color="D6E0F2" w:sz="1"/>
+              <w:left w:val="single" w:color="D6E0F2" w:sz="1"/>
+              <w:bottom w:val="single" w:color="D6E0F2" w:sz="1"/>
+              <w:right w:val="single" w:color="D6E0F2" w:sz="1"/>
+            </w:tcBorders>
+            <w:shd w:fill="EEF2FA" w:val="clear"/>
+            <w:tcMar>
+              <w:top w:type="dxa" w:w="80"/>
+              <w:left w:type="dxa" w:w="120"/>
+              <w:bottom w:type="dxa" w:w="80"/>
+              <w:right w:type="dxa" w:w="120"/>
+            </w:tcMar>
+            <w:vAlign w:val="center"/>
+          </w:tcPr>
+          <w:p>
+            <w:pPr>
+              <w:spacing w:after="40" w:before="40"/>
+            </w:pPr>
+            <w:r>
+              <w:rPr>
+                <w:rFonts w:ascii="Arial" w:cs="Arial" w:eastAsia="Arial" w:hAnsi="Arial"/>
+                <w:b w:val="false"/>
+                <w:bCs w:val="false"/>
+                <w:color w:val="0A1628"/>
+                <w:sz w:val="20"/>
+                <w:szCs w:val="20"/>
+              </w:rPr>
+              <w:t xml:space="preserve">引用完整性</w:t>
+            </w:r>
+          </w:p>
+        </w:tc>
+        <w:tc>
+          <w:tcPr>
+            <w:tcW w:type="dxa" w:w="3160"/>
+            <w:tcBorders>
+              <w:top w:val="single" w:color="D6E0F2" w:sz="1"/>
+              <w:left w:val="single" w:color="D6E0F2" w:sz="1"/>
+              <w:bottom w:val="single" w:color="D6E0F2" w:sz="1"/>
+              <w:right w:val="single" w:color="D6E0F2" w:sz="1"/>
+            </w:tcBorders>
+            <w:shd w:fill="EEF2FA" w:val="clear"/>
+            <w:tcMar>
+              <w:top w:type="dxa" w:w="80"/>
+              <w:left w:type="dxa" w:w="120"/>
+              <w:bottom w:type="dxa" w:w="80"/>
+              <w:right w:type="dxa" w:w="120"/>
+            </w:tcMar>
+            <w:vAlign w:val="center"/>
+          </w:tcPr>
+          <w:p>
+            <w:pPr>
+              <w:spacing w:after="40" w:before="40"/>
+            </w:pPr>
+            <w:r>
+              <w:rPr>
+                <w:rFonts w:ascii="Arial" w:cs="Arial" w:eastAsia="Arial" w:hAnsi="Arial"/>
+                <w:b w:val="false"/>
+                <w:bCs w:val="false"/>
+                <w:color w:val="0A1628"/>
+                <w:sz w:val="20"/>
+                <w:szCs w:val="20"/>
+              </w:rPr>
+              <w:t xml:space="preserve">引用格式是否足够完整（至少包含作者/年份/核心结论之一）</w:t>
+            </w:r>
+          </w:p>
+        </w:tc>
+        <w:tc>
+          <w:tcPr>
+            <w:tcW w:type="dxa" w:w="4200"/>
+            <w:tcBorders>
+              <w:top w:val="single" w:color="D6E0F2" w:sz="1"/>
+              <w:left w:val="single" w:color="D6E0F2" w:sz="1"/>
+              <w:bottom w:val="single" w:color="D6E0F2" w:sz="1"/>
+              <w:right w:val="single" w:color="D6E0F2" w:sz="1"/>
+            </w:tcBorders>
+            <w:shd w:fill="EEF2FA" w:val="clear"/>
+            <w:tcMar>
+              <w:top w:type="dxa" w:w="80"/>
+              <w:left w:type="dxa" w:w="120"/>
+              <w:bottom w:type="dxa" w:w="80"/>
+              <w:right w:type="dxa" w:w="120"/>
+            </w:tcMar>
+            <w:vAlign w:val="center"/>
+          </w:tcPr>
+          <w:p>
+            <w:pPr>
+              <w:spacing w:after="40" w:before="40"/>
+            </w:pPr>
+            <w:r>
+              <w:rPr>
+                <w:rFonts w:ascii="Arial" w:cs="Arial" w:eastAsia="Arial" w:hAnsi="Arial"/>
+                <w:b w:val="false"/>
+                <w:bCs w:val="false"/>
+                <w:color w:val="0A1628"/>
+                <w:sz w:val="20"/>
+                <w:szCs w:val="20"/>
+              </w:rPr>
+              <w:t xml:space="preserve">可信度评分 + 问题说明</w:t>
+            </w:r>
+          </w:p>
+        </w:tc>
+      </w:tr>
+      <w:tr>
+        <w:tc>
+          <w:tcPr>
+            <w:tcW w:type="dxa" w:w="2000"/>
+            <w:tcBorders>
+              <w:top w:val="single" w:color="D6E0F2" w:sz="1"/>
+              <w:left w:val="single" w:color="D6E0F2" w:sz="1"/>
+              <w:bottom w:val="single" w:color="D6E0F2" w:sz="1"/>
+              <w:right w:val="single" w:color="D6E0F2" w:sz="1"/>
+            </w:tcBorders>
+            <w:shd w:fill="FFFFFF" w:val="clear"/>
+            <w:tcMar>
+              <w:top w:type="dxa" w:w="80"/>
+              <w:left w:type="dxa" w:w="120"/>
+              <w:bottom w:type="dxa" w:w="80"/>
+              <w:right w:type="dxa" w:w="120"/>
+            </w:tcMar>
+            <w:vAlign w:val="center"/>
+          </w:tcPr>
+          <w:p>
+            <w:pPr>
+              <w:spacing w:after="40" w:before="40"/>
+            </w:pPr>
+            <w:r>
+              <w:rPr>
+                <w:rFonts w:ascii="Arial" w:cs="Arial" w:eastAsia="Arial" w:hAnsi="Arial"/>
+                <w:b w:val="false"/>
+                <w:bCs w:val="false"/>
+                <w:color w:val="0A1628"/>
+                <w:sz w:val="20"/>
+                <w:szCs w:val="20"/>
+              </w:rPr>
+              <w:t xml:space="preserve">引用一致性</w:t>
+            </w:r>
+          </w:p>
+        </w:tc>
+        <w:tc>
+          <w:tcPr>
+            <w:tcW w:type="dxa" w:w="3160"/>
+            <w:tcBorders>
+              <w:top w:val="single" w:color="D6E0F2" w:sz="1"/>
+              <w:left w:val="single" w:color="D6E0F2" w:sz="1"/>
+              <w:bottom w:val="single" w:color="D6E0F2" w:sz="1"/>
+              <w:right w:val="single" w:color="D6E0F2" w:sz="1"/>
+            </w:tcBorders>
+            <w:shd w:fill="FFFFFF" w:val="clear"/>
+            <w:tcMar>
+              <w:top w:type="dxa" w:w="80"/>
+              <w:left w:type="dxa" w:w="120"/>
+              <w:bottom w:type="dxa" w:w="80"/>
+              <w:right w:type="dxa" w:w="120"/>
+            </w:tcMar>
+            <w:vAlign w:val="center"/>
+          </w:tcPr>
+          <w:p>
+            <w:pPr>
+              <w:spacing w:after="40" w:before="40"/>
+            </w:pPr>
+            <w:r>
+              <w:rPr>
+                <w:rFonts w:ascii="Arial" w:cs="Arial" w:eastAsia="Arial" w:hAnsi="Arial"/>
+                <w:b w:val="false"/>
+                <w:bCs w:val="false"/>
+                <w:color w:val="0A1628"/>
+                <w:sz w:val="20"/>
+                <w:szCs w:val="20"/>
+              </w:rPr>
+              <w:t xml:space="preserve">不同 Agent 引用同类文献时是否得出矛盾结论，矛盾是否被解释</w:t>
+            </w:r>
+          </w:p>
+        </w:tc>
+        <w:tc>
+          <w:tcPr>
+            <w:tcW w:type="dxa" w:w="4200"/>
+            <w:tcBorders>
+              <w:top w:val="single" w:color="D6E0F2" w:sz="1"/>
+              <w:left w:val="single" w:color="D6E0F2" w:sz="1"/>
+              <w:bottom w:val="single" w:color="D6E0F2" w:sz="1"/>
+              <w:right w:val="single" w:color="D6E0F2" w:sz="1"/>
+            </w:tcBorders>
+            <w:shd w:fill="FFFFFF" w:val="clear"/>
+            <w:tcMar>
+              <w:top w:type="dxa" w:w="80"/>
+              <w:left w:type="dxa" w:w="120"/>
+              <w:bottom w:type="dxa" w:w="80"/>
+              <w:right w:type="dxa" w:w="120"/>
+            </w:tcMar>
+            <w:vAlign w:val="center"/>
+          </w:tcPr>
+          <w:p>
+            <w:pPr>
+              <w:spacing w:after="40" w:before="40"/>
+            </w:pPr>
+            <w:r>
+              <w:rPr>
+                <w:rFonts w:ascii="Arial" w:cs="Arial" w:eastAsia="Arial" w:hAnsi="Arial"/>
+                <w:b w:val="false"/>
+                <w:bCs w:val="false"/>
+                <w:color w:val="0A1628"/>
+                <w:sz w:val="20"/>
+                <w:szCs w:val="20"/>
+              </w:rPr>
+              <w:t xml:space="preserve">可信度评分 + 矛盾说明</w:t>
+            </w:r>
+          </w:p>
+        </w:tc>
+      </w:tr>
+      <w:tr>
+        <w:tc>
+          <w:tcPr>
+            <w:tcW w:type="dxa" w:w="2000"/>
+            <w:tcBorders>
+              <w:top w:val="single" w:color="D6E0F2" w:sz="1"/>
+              <w:left w:val="single" w:color="D6E0F2" w:sz="1"/>
+              <w:bottom w:val="single" w:color="D6E0F2" w:sz="1"/>
+              <w:right w:val="single" w:color="D6E0F2" w:sz="1"/>
+            </w:tcBorders>
+            <w:shd w:fill="EEF2FA" w:val="clear"/>
+            <w:tcMar>
+              <w:top w:type="dxa" w:w="80"/>
+              <w:left w:type="dxa" w:w="120"/>
+              <w:bottom w:type="dxa" w:w="80"/>
+              <w:right w:type="dxa" w:w="120"/>
+            </w:tcMar>
+            <w:vAlign w:val="center"/>
+          </w:tcPr>
+          <w:p>
+            <w:pPr>
+              <w:spacing w:after="40" w:before="40"/>
+            </w:pPr>
+            <w:r>
+              <w:rPr>
+                <w:rFonts w:ascii="Arial" w:cs="Arial" w:eastAsia="Arial" w:hAnsi="Arial"/>
+                <w:b w:val="false"/>
+                <w:bCs w:val="false"/>
+                <w:color w:val="0A1628"/>
+                <w:sz w:val="20"/>
+                <w:szCs w:val="20"/>
+              </w:rPr>
+              <w:t xml:space="preserve">引用密度</w:t>
+            </w:r>
+          </w:p>
+        </w:tc>
+        <w:tc>
+          <w:tcPr>
+            <w:tcW w:type="dxa" w:w="3160"/>
+            <w:tcBorders>
+              <w:top w:val="single" w:color="D6E0F2" w:sz="1"/>
+              <w:left w:val="single" w:color="D6E0F2" w:sz="1"/>
+              <w:bottom w:val="single" w:color="D6E0F2" w:sz="1"/>
+              <w:right w:val="single" w:color="D6E0F2" w:sz="1"/>
+            </w:tcBorders>
+            <w:shd w:fill="EEF2FA" w:val="clear"/>
+            <w:tcMar>
+              <w:top w:type="dxa" w:w="80"/>
+              <w:left w:type="dxa" w:w="120"/>
+              <w:bottom w:type="dxa" w:w="80"/>
+              <w:right w:type="dxa" w:w="120"/>
+            </w:tcMar>
+            <w:vAlign w:val="center"/>
+          </w:tcPr>
+          <w:p>
+            <w:pPr>
+              <w:spacing w:after="40" w:before="40"/>
+            </w:pPr>
+            <w:r>
+              <w:rPr>
+                <w:rFonts w:ascii="Arial" w:cs="Arial" w:eastAsia="Arial" w:hAnsi="Arial"/>
+                <w:b w:val="false"/>
+                <w:bCs w:val="false"/>
+                <w:color w:val="0A1628"/>
+                <w:sz w:val="20"/>
+                <w:szCs w:val="20"/>
+              </w:rPr>
+              <w:t xml:space="preserve">相对于论点数量，引用密度是否不足，哪些关键论断缺乏支撑</w:t>
+            </w:r>
+          </w:p>
+        </w:tc>
+        <w:tc>
+          <w:tcPr>
+            <w:tcW w:type="dxa" w:w="4200"/>
+            <w:tcBorders>
+              <w:top w:val="single" w:color="D6E0F2" w:sz="1"/>
+              <w:left w:val="single" w:color="D6E0F2" w:sz="1"/>
+              <w:bottom w:val="single" w:color="D6E0F2" w:sz="1"/>
+              <w:right w:val="single" w:color="D6E0F2" w:sz="1"/>
+            </w:tcBorders>
+            <w:shd w:fill="EEF2FA" w:val="clear"/>
+            <w:tcMar>
+              <w:top w:type="dxa" w:w="80"/>
+              <w:left w:type="dxa" w:w="120"/>
+              <w:bottom w:type="dxa" w:w="80"/>
+              <w:right w:type="dxa" w:w="120"/>
+            </w:tcMar>
+            <w:vAlign w:val="center"/>
+          </w:tcPr>
+          <w:p>
+            <w:pPr>
+              <w:spacing w:after="40" w:before="40"/>
+            </w:pPr>
+            <w:r>
+              <w:rPr>
+                <w:rFonts w:ascii="Arial" w:cs="Arial" w:eastAsia="Arial" w:hAnsi="Arial"/>
+                <w:b w:val="false"/>
+                <w:bCs w:val="false"/>
+                <w:color w:val="0A1628"/>
+                <w:sz w:val="20"/>
+                <w:szCs w:val="20"/>
+              </w:rPr>
+              <w:t xml:space="preserve">缺失引用论断清单</w:t>
+            </w:r>
+          </w:p>
+        </w:tc>
+      </w:tr>
+    </w:tbl>
+    <w:p>
+      <w:pPr>
+        <w:spacing w:after="40" w:before="0"/>
+      </w:pPr>
+    </w:p>
+    <w:p>
+      <w:pPr>
+        <w:spacing w:after="80" w:before="60"/>
+      </w:pPr>
+      <w:r>
+        <w:rPr>
+          <w:rFonts w:ascii="Arial" w:cs="Arial" w:eastAsia="Arial" w:hAnsi="Arial"/>
+          <w:b w:val="false"/>
+          <w:bCs w:val="false"/>
+          <w:color w:val="0A1628"/>
+          <w:sz w:val="22"/>
+          <w:szCs w:val="22"/>
+        </w:rPr>
+        <w:t xml:space="preserve">最终输出「整体引用质量评级（A/B/C/D）」和「需要补充文献的关键论断清单」。前端以紫罗兰色（#6B4FB8）边框卡片展示审查报告。</w:t>
+      </w:r>
+    </w:p>
+    <w:p>
+      <w:pPr>
+        <w:spacing w:after="40" w:before="0"/>
+      </w:pPr>
+    </w:p>
+    <w:p>
+      <w:pPr>
+        <w:spacing w:after="80" w:before="60"/>
+      </w:pPr>
+      <w:r>
+        <w:rPr>
+          <w:rFonts w:ascii="Arial" w:cs="Arial" w:eastAsia="Arial" w:hAnsi="Arial"/>
+          <w:b w:val="false"/>
+          <w:bCs w:val="false"/>
+          <w:color w:val="0A1628"/>
+          <w:sz w:val="22"/>
+          <w:szCs w:val="22"/>
+        </w:rPr>
+        <w:t xml:space="preserve">技术实现：citation_review_prompt() 从所有 debate_messages 中提取「### 外部引用」小节，格式化为「Agent: X (Round Y) 引用的文献清单」后送入模型；validate_output_complete() 验证输出中包含「引用相关性」「引用密度」「整体引用质量」等关键字段。</w:t>
       </w:r>
     </w:p>
     <w:p>
@@ -9044,6 +11027,113 @@
               <w:bottom w:val="single" w:color="D6E0F2" w:sz="1"/>
               <w:right w:val="single" w:color="D6E0F2" w:sz="1"/>
             </w:tcBorders>
+            <w:shd w:fill="FFFFFF" w:val="clear"/>
+            <w:tcMar>
+              <w:top w:type="dxa" w:w="80"/>
+              <w:left w:type="dxa" w:w="120"/>
+              <w:bottom w:type="dxa" w:w="80"/>
+              <w:right w:type="dxa" w:w="120"/>
+            </w:tcMar>
+            <w:vAlign w:val="center"/>
+          </w:tcPr>
+          <w:p>
+            <w:pPr>
+              <w:spacing w:after="40" w:before="40"/>
+            </w:pPr>
+            <w:r>
+              <w:rPr>
+                <w:rFonts w:ascii="Arial" w:cs="Arial" w:eastAsia="Arial" w:hAnsi="Arial"/>
+                <w:b w:val="false"/>
+                <w:bCs w:val="false"/>
+                <w:color w:val="0A1628"/>
+                <w:sz w:val="20"/>
+                <w:szCs w:val="20"/>
+              </w:rPr>
+              <w:t xml:space="preserve">⑩</w:t>
+            </w:r>
+          </w:p>
+        </w:tc>
+        <w:tc>
+          <w:tcPr>
+            <w:tcW w:type="dxa" w:w="3360"/>
+            <w:tcBorders>
+              <w:top w:val="single" w:color="D6E0F2" w:sz="1"/>
+              <w:left w:val="single" w:color="D6E0F2" w:sz="1"/>
+              <w:bottom w:val="single" w:color="D6E0F2" w:sz="1"/>
+              <w:right w:val="single" w:color="D6E0F2" w:sz="1"/>
+            </w:tcBorders>
+            <w:shd w:fill="FFFFFF" w:val="clear"/>
+            <w:tcMar>
+              <w:top w:type="dxa" w:w="80"/>
+              <w:left w:type="dxa" w:w="120"/>
+              <w:bottom w:type="dxa" w:w="80"/>
+              <w:right w:type="dxa" w:w="120"/>
+            </w:tcMar>
+            <w:vAlign w:val="center"/>
+          </w:tcPr>
+          <w:p>
+            <w:pPr>
+              <w:spacing w:after="40" w:before="40"/>
+            </w:pPr>
+            <w:r>
+              <w:rPr>
+                <w:rFonts w:ascii="Arial" w:cs="Arial" w:eastAsia="Arial" w:hAnsi="Arial"/>
+                <w:b w:val="false"/>
+                <w:bCs w:val="false"/>
+                <w:color w:val="0A1628"/>
+                <w:sz w:val="20"/>
+                <w:szCs w:val="20"/>
+              </w:rPr>
+              <w:t xml:space="preserve">本地优先 + 数据安全</w:t>
+            </w:r>
+          </w:p>
+        </w:tc>
+        <w:tc>
+          <w:tcPr>
+            <w:tcW w:type="dxa" w:w="4800"/>
+            <w:tcBorders>
+              <w:top w:val="single" w:color="D6E0F2" w:sz="1"/>
+              <w:left w:val="single" w:color="D6E0F2" w:sz="1"/>
+              <w:bottom w:val="single" w:color="D6E0F2" w:sz="1"/>
+              <w:right w:val="single" w:color="D6E0F2" w:sz="1"/>
+            </w:tcBorders>
+            <w:shd w:fill="FFFFFF" w:val="clear"/>
+            <w:tcMar>
+              <w:top w:type="dxa" w:w="80"/>
+              <w:left w:type="dxa" w:w="120"/>
+              <w:bottom w:type="dxa" w:w="80"/>
+              <w:right w:type="dxa" w:w="120"/>
+            </w:tcMar>
+            <w:vAlign w:val="center"/>
+          </w:tcPr>
+          <w:p>
+            <w:pPr>
+              <w:spacing w:after="40" w:before="40"/>
+            </w:pPr>
+            <w:r>
+              <w:rPr>
+                <w:rFonts w:ascii="Arial" w:cs="Arial" w:eastAsia="Arial" w:hAnsi="Arial"/>
+                <w:b w:val="false"/>
+                <w:bCs w:val="false"/>
+                <w:color w:val="0A1628"/>
+                <w:sz w:val="20"/>
+                <w:szCs w:val="20"/>
+              </w:rPr>
+              <w:t xml:space="preserve">全程本地运行，API Key 不落盘，SQLite 脱敏存储，适合科研环境的数据安全要求</w:t>
+            </w:r>
+          </w:p>
+        </w:tc>
+      </w:tr>
+      <w:tr>
+        <w:tc>
+          <w:tcPr>
+            <w:tcW w:type="dxa" w:w="1200"/>
+            <w:tcBorders>
+              <w:top w:val="single" w:color="D6E0F2" w:sz="1"/>
+              <w:left w:val="single" w:color="D6E0F2" w:sz="1"/>
+              <w:bottom w:val="single" w:color="D6E0F2" w:sz="1"/>
+              <w:right w:val="single" w:color="D6E0F2" w:sz="1"/>
+            </w:tcBorders>
             <w:shd w:fill="EEF2FA" w:val="clear"/>
             <w:tcMar>
               <w:top w:type="dxa" w:w="80"/>
@@ -9066,7 +11156,7 @@
                 <w:sz w:val="20"/>
                 <w:szCs w:val="20"/>
               </w:rPr>
-              <w:t xml:space="preserve">⑩</w:t>
+              <w:t xml:space="preserve">⑪</w:t>
             </w:r>
           </w:p>
         </w:tc>
@@ -9101,7 +11191,7 @@
                 <w:sz w:val="20"/>
                 <w:szCs w:val="20"/>
               </w:rPr>
-              <w:t xml:space="preserve">本地优先 + 数据安全</w:t>
+              <w:t xml:space="preserve">Critique Agent 独立批判</w:t>
             </w:r>
           </w:p>
         </w:tc>
@@ -9136,7 +11226,114 @@
                 <w:sz w:val="20"/>
                 <w:szCs w:val="20"/>
               </w:rPr>
-              <w:t xml:space="preserve">全程本地运行，API Key 不落盘，SQLite 脱敏存储，适合科研环境的数据安全要求</w:t>
+              <w:t xml:space="preserve">所有辩论轮次结束后执行六维风险评估（创新性/证据链/可行性/一致性/偏见/下一步风险），输出综合风险等级 + Top-3 风险清单</w:t>
+            </w:r>
+          </w:p>
+        </w:tc>
+      </w:tr>
+      <w:tr>
+        <w:tc>
+          <w:tcPr>
+            <w:tcW w:type="dxa" w:w="1200"/>
+            <w:tcBorders>
+              <w:top w:val="single" w:color="D6E0F2" w:sz="1"/>
+              <w:left w:val="single" w:color="D6E0F2" w:sz="1"/>
+              <w:bottom w:val="single" w:color="D6E0F2" w:sz="1"/>
+              <w:right w:val="single" w:color="D6E0F2" w:sz="1"/>
+            </w:tcBorders>
+            <w:shd w:fill="FFFFFF" w:val="clear"/>
+            <w:tcMar>
+              <w:top w:type="dxa" w:w="80"/>
+              <w:left w:type="dxa" w:w="120"/>
+              <w:bottom w:type="dxa" w:w="80"/>
+              <w:right w:type="dxa" w:w="120"/>
+            </w:tcMar>
+            <w:vAlign w:val="center"/>
+          </w:tcPr>
+          <w:p>
+            <w:pPr>
+              <w:spacing w:after="40" w:before="40"/>
+            </w:pPr>
+            <w:r>
+              <w:rPr>
+                <w:rFonts w:ascii="Arial" w:cs="Arial" w:eastAsia="Arial" w:hAnsi="Arial"/>
+                <w:b w:val="false"/>
+                <w:bCs w:val="false"/>
+                <w:color w:val="0A1628"/>
+                <w:sz w:val="20"/>
+                <w:szCs w:val="20"/>
+              </w:rPr>
+              <w:t xml:space="preserve">⑫</w:t>
+            </w:r>
+          </w:p>
+        </w:tc>
+        <w:tc>
+          <w:tcPr>
+            <w:tcW w:type="dxa" w:w="3360"/>
+            <w:tcBorders>
+              <w:top w:val="single" w:color="D6E0F2" w:sz="1"/>
+              <w:left w:val="single" w:color="D6E0F2" w:sz="1"/>
+              <w:bottom w:val="single" w:color="D6E0F2" w:sz="1"/>
+              <w:right w:val="single" w:color="D6E0F2" w:sz="1"/>
+            </w:tcBorders>
+            <w:shd w:fill="FFFFFF" w:val="clear"/>
+            <w:tcMar>
+              <w:top w:type="dxa" w:w="80"/>
+              <w:left w:type="dxa" w:w="120"/>
+              <w:bottom w:type="dxa" w:w="80"/>
+              <w:right w:type="dxa" w:w="120"/>
+            </w:tcMar>
+            <w:vAlign w:val="center"/>
+          </w:tcPr>
+          <w:p>
+            <w:pPr>
+              <w:spacing w:after="40" w:before="40"/>
+            </w:pPr>
+            <w:r>
+              <w:rPr>
+                <w:rFonts w:ascii="Arial" w:cs="Arial" w:eastAsia="Arial" w:hAnsi="Arial"/>
+                <w:b w:val="false"/>
+                <w:bCs w:val="false"/>
+                <w:color w:val="0A1628"/>
+                <w:sz w:val="20"/>
+                <w:szCs w:val="20"/>
+              </w:rPr>
+              <w:t xml:space="preserve">Citation Review Agent 引用验证</w:t>
+            </w:r>
+          </w:p>
+        </w:tc>
+        <w:tc>
+          <w:tcPr>
+            <w:tcW w:type="dxa" w:w="4800"/>
+            <w:tcBorders>
+              <w:top w:val="single" w:color="D6E0F2" w:sz="1"/>
+              <w:left w:val="single" w:color="D6E0F2" w:sz="1"/>
+              <w:bottom w:val="single" w:color="D6E0F2" w:sz="1"/>
+              <w:right w:val="single" w:color="D6E0F2" w:sz="1"/>
+            </w:tcBorders>
+            <w:shd w:fill="FFFFFF" w:val="clear"/>
+            <w:tcMar>
+              <w:top w:type="dxa" w:w="80"/>
+              <w:left w:type="dxa" w:w="120"/>
+              <w:bottom w:type="dxa" w:w="80"/>
+              <w:right w:type="dxa" w:w="120"/>
+            </w:tcMar>
+            <w:vAlign w:val="center"/>
+          </w:tcPr>
+          <w:p>
+            <w:pPr>
+              <w:spacing w:after="40" w:before="40"/>
+            </w:pPr>
+            <w:r>
+              <w:rPr>
+                <w:rFonts w:ascii="Arial" w:cs="Arial" w:eastAsia="Arial" w:hAnsi="Arial"/>
+                <w:b w:val="false"/>
+                <w:bCs w:val="false"/>
+                <w:color w:val="0A1628"/>
+                <w:sz w:val="20"/>
+                <w:szCs w:val="20"/>
+              </w:rPr>
+              <w:t xml:space="preserve">独立 Agent 对全部讨论引用进行语义交叉校验，四维审查输出 A/B/C/D 质量评级，消除幻觉引用</w:t>
             </w:r>
           </w:p>
         </w:tc>
@@ -9188,7 +11385,7 @@
           <w:sz w:val="26"/>
           <w:szCs w:val="26"/>
         </w:rPr>
-        <w:t xml:space="preserve">近期（已规划）</w:t>
+        <w:t xml:space="preserve">已完成</w:t>
       </w:r>
     </w:p>
     <w:p>
@@ -9209,7 +11406,7 @@
           <w:sz w:val="22"/>
           <w:szCs w:val="22"/>
         </w:rPr>
-        <w:t xml:space="preserve">TF-IDF 记忆检索引擎：从历史 StructuredIRV2 中提取 MemoryEntry，支持跨 Run 的知识检索。</w:t>
+        <w:t xml:space="preserve">Critique 独立阶段：在所有辩论轮次结束后引入六维结构化批判审查，产出独立风险评估报告（含综合风险等级 + Top-3 风险）。✓</w:t>
       </w:r>
     </w:p>
     <w:p>
@@ -9230,7 +11427,7 @@
           <w:sz w:val="22"/>
           <w:szCs w:val="22"/>
         </w:rPr>
-        <w:t xml:space="preserve">Critique 独立阶段：在 Moderator 之后引入结构化批判轮次，产出独立的风险评估报告。</w:t>
+        <w:t xml:space="preserve">Citation Review Agent 制度化：独立引用真实性审查 Agent，对所有辩论引用进行语义交叉校验，输出 A/B/C/D 评级。✓</w:t>
       </w:r>
     </w:p>
     <w:p>
@@ -9251,7 +11448,7 @@
           <w:sz w:val="22"/>
           <w:szCs w:val="22"/>
         </w:rPr>
-        <w:t xml:space="preserve">PyInstaller 单文件封装：将前后端打包为本机可执行文件，消除 Python / Node 环境依赖。</w:t>
+        <w:t xml:space="preserve">端到端逐字流式输出：双 SSE 通道（状态 800ms + token 100ms），幻影卡片无缝过渡。✓</w:t>
       </w:r>
     </w:p>
     <w:p>
@@ -9273,7 +11470,7 @@
           <w:sz w:val="26"/>
           <w:szCs w:val="26"/>
         </w:rPr>
-        <w:t xml:space="preserve">中期（规划中）</w:t>
+        <w:t xml:space="preserve">近期（已规划）</w:t>
       </w:r>
     </w:p>
     <w:p>
@@ -9294,7 +11491,7 @@
           <w:sz w:val="22"/>
           <w:szCs w:val="22"/>
         </w:rPr>
-        <w:t xml:space="preserve">嵌入向量记忆检索：从 TF-IDF 升级至本地 embedding（如 BGE-M3），提升跨会话记忆检索精度。</w:t>
+        <w:t xml:space="preserve">TF-IDF 记忆检索引擎：从历史 StructuredIRV2 中提取 MemoryEntry，支持跨 Run 的知识检索。</w:t>
       </w:r>
     </w:p>
     <w:p>
@@ -9315,7 +11512,50 @@
           <w:sz w:val="22"/>
           <w:szCs w:val="22"/>
         </w:rPr>
-        <w:t xml:space="preserve">Agent Critique 制度化：引入独立的证据语义审查 Agent，对 Agent 引用的文献进行真实性交叉校验。</w:t>
+        <w:t xml:space="preserve">PyInstaller 单文件封装：将前后端打包为本机可执行文件，消除 Python / Node 环境依赖。</w:t>
+      </w:r>
+    </w:p>
+    <w:p>
+      <w:pPr>
+        <w:spacing w:after="40" w:before="0"/>
+      </w:pPr>
+    </w:p>
+    <w:p>
+      <w:pPr>
+        <w:pStyle w:val="Heading2"/>
+        <w:spacing w:after="120" w:before="240"/>
+      </w:pPr>
+      <w:r>
+        <w:rPr>
+          <w:rFonts w:ascii="Arial" w:cs="Arial" w:eastAsia="Arial" w:hAnsi="Arial"/>
+          <w:b/>
+          <w:bCs/>
+          <w:color w:val="0A1628"/>
+          <w:sz w:val="26"/>
+          <w:szCs w:val="26"/>
+        </w:rPr>
+        <w:t xml:space="preserve">中期（规划中）</w:t>
+      </w:r>
+    </w:p>
+    <w:p>
+      <w:pPr>
+        <w:pStyle w:val="ListParagraph"/>
+        <w:numPr>
+          <w:ilvl w:val="0"/>
+          <w:numId w:val="2"/>
+        </w:numPr>
+        <w:spacing w:after="40" w:before="40"/>
+      </w:pPr>
+      <w:r>
+        <w:rPr>
+          <w:rFonts w:ascii="Arial" w:cs="Arial" w:eastAsia="Arial" w:hAnsi="Arial"/>
+          <w:b w:val="false"/>
+          <w:bCs w:val="false"/>
+          <w:color w:val="0A1628"/>
+          <w:sz w:val="22"/>
+          <w:szCs w:val="22"/>
+        </w:rPr>
+        <w:t xml:space="preserve">嵌入向量记忆检索：从 TF-IDF 升级至本地 embedding（如 BGE-M3），提升跨会话记忆检索精度。</w:t>
       </w:r>
     </w:p>
     <w:p>
@@ -10660,7 +12900,7 @@
           <w:sz w:val="18"/>
           <w:szCs w:val="18"/>
         </w:rPr>
-        <w:t xml:space="preserve">K-Storm 文档版本 V1.6  ·  </w:t>
+        <w:t xml:space="preserve">K-Storm 文档版本 V2.0  ·  </w:t>
       </w:r>
       <w:r>
         <w:rPr>
@@ -10847,7 +13087,7 @@
         <w:sz w:val="18"/>
         <w:szCs w:val="18"/>
       </w:rPr>
-      <w:t xml:space="preserve">	系统设计文档 V1.6</w:t>
+      <w:t xml:space="preserve">	系统设计文档 V2.0</w:t>
     </w:r>
   </w:p>
 </w:hdr>

</xml_diff>

<commit_message>
docs: update Architecture section in README to reflect 9-agent pipeline
- README.md / README.zh-CN.md: replace 'four complementary roles' with full 9-agent list grouped into debate group and orchestration/synthesis layer
</commit_message>
<xml_diff>
--- a/K-Storm-设计文档.docx
+++ b/K-Storm-设计文档.docx
@@ -11338,6 +11338,113 @@
           </w:p>
         </w:tc>
       </w:tr>
+      <w:tr>
+        <w:tc>
+          <w:tcPr>
+            <w:tcW w:type="dxa" w:w="1200"/>
+            <w:tcBorders>
+              <w:top w:val="single" w:color="D6E0F2" w:sz="1"/>
+              <w:left w:val="single" w:color="D6E0F2" w:sz="1"/>
+              <w:bottom w:val="single" w:color="D6E0F2" w:sz="1"/>
+              <w:right w:val="single" w:color="D6E0F2" w:sz="1"/>
+            </w:tcBorders>
+            <w:shd w:fill="EEF2FA" w:val="clear"/>
+            <w:tcMar>
+              <w:top w:type="dxa" w:w="80"/>
+              <w:left w:type="dxa" w:w="120"/>
+              <w:bottom w:type="dxa" w:w="80"/>
+              <w:right w:type="dxa" w:w="120"/>
+            </w:tcMar>
+            <w:vAlign w:val="center"/>
+          </w:tcPr>
+          <w:p>
+            <w:pPr>
+              <w:spacing w:after="40" w:before="40"/>
+            </w:pPr>
+            <w:r>
+              <w:rPr>
+                <w:rFonts w:ascii="Arial" w:cs="Arial" w:eastAsia="Arial" w:hAnsi="Arial"/>
+                <w:b w:val="false"/>
+                <w:bCs w:val="false"/>
+                <w:color w:val="0A1628"/>
+                <w:sz w:val="20"/>
+                <w:szCs w:val="20"/>
+              </w:rPr>
+              <w:t xml:space="preserve">⑬</w:t>
+            </w:r>
+          </w:p>
+        </w:tc>
+        <w:tc>
+          <w:tcPr>
+            <w:tcW w:type="dxa" w:w="3360"/>
+            <w:tcBorders>
+              <w:top w:val="single" w:color="D6E0F2" w:sz="1"/>
+              <w:left w:val="single" w:color="D6E0F2" w:sz="1"/>
+              <w:bottom w:val="single" w:color="D6E0F2" w:sz="1"/>
+              <w:right w:val="single" w:color="D6E0F2" w:sz="1"/>
+            </w:tcBorders>
+            <w:shd w:fill="EEF2FA" w:val="clear"/>
+            <w:tcMar>
+              <w:top w:type="dxa" w:w="80"/>
+              <w:left w:type="dxa" w:w="120"/>
+              <w:bottom w:type="dxa" w:w="80"/>
+              <w:right w:type="dxa" w:w="120"/>
+            </w:tcMar>
+            <w:vAlign w:val="center"/>
+          </w:tcPr>
+          <w:p>
+            <w:pPr>
+              <w:spacing w:after="40" w:before="40"/>
+            </w:pPr>
+            <w:r>
+              <w:rPr>
+                <w:rFonts w:ascii="Arial" w:cs="Arial" w:eastAsia="Arial" w:hAnsi="Arial"/>
+                <w:b w:val="false"/>
+                <w:bCs w:val="false"/>
+                <w:color w:val="0A1628"/>
+                <w:sz w:val="20"/>
+                <w:szCs w:val="20"/>
+              </w:rPr>
+              <w:t xml:space="preserve">TF-IDF 跨 Run 记忆检索</w:t>
+            </w:r>
+          </w:p>
+        </w:tc>
+        <w:tc>
+          <w:tcPr>
+            <w:tcW w:type="dxa" w:w="4800"/>
+            <w:tcBorders>
+              <w:top w:val="single" w:color="D6E0F2" w:sz="1"/>
+              <w:left w:val="single" w:color="D6E0F2" w:sz="1"/>
+              <w:bottom w:val="single" w:color="D6E0F2" w:sz="1"/>
+              <w:right w:val="single" w:color="D6E0F2" w:sz="1"/>
+            </w:tcBorders>
+            <w:shd w:fill="EEF2FA" w:val="clear"/>
+            <w:tcMar>
+              <w:top w:type="dxa" w:w="80"/>
+              <w:left w:type="dxa" w:w="120"/>
+              <w:bottom w:type="dxa" w:w="80"/>
+              <w:right w:type="dxa" w:w="120"/>
+            </w:tcMar>
+            <w:vAlign w:val="center"/>
+          </w:tcPr>
+          <w:p>
+            <w:pPr>
+              <w:spacing w:after="40" w:before="40"/>
+            </w:pPr>
+            <w:r>
+              <w:rPr>
+                <w:rFonts w:ascii="Arial" w:cs="Arial" w:eastAsia="Arial" w:hAnsi="Arial"/>
+                <w:b w:val="false"/>
+                <w:bCs w:val="false"/>
+                <w:color w:val="0A1628"/>
+                <w:sz w:val="20"/>
+                <w:szCs w:val="20"/>
+              </w:rPr>
+              <w:t xml:space="preserve">从所有历史 StructuredIRV2 提取 5 类 MemoryEntry，纯 stdlib 实现字符 bigram + TF-IDF 余弦检索，零外部依赖，支持类型与领域过滤</w:t>
+            </w:r>
+          </w:p>
+        </w:tc>
+      </w:tr>
     </w:tbl>
     <w:p>
       <w:pPr>
@@ -11453,28 +11560,6 @@
     </w:p>
     <w:p>
       <w:pPr>
-        <w:spacing w:after="40" w:before="0"/>
-      </w:pPr>
-    </w:p>
-    <w:p>
-      <w:pPr>
-        <w:pStyle w:val="Heading2"/>
-        <w:spacing w:after="120" w:before="240"/>
-      </w:pPr>
-      <w:r>
-        <w:rPr>
-          <w:rFonts w:ascii="Arial" w:cs="Arial" w:eastAsia="Arial" w:hAnsi="Arial"/>
-          <w:b/>
-          <w:bCs/>
-          <w:color w:val="0A1628"/>
-          <w:sz w:val="26"/>
-          <w:szCs w:val="26"/>
-        </w:rPr>
-        <w:t xml:space="preserve">近期（已规划）</w:t>
-      </w:r>
-    </w:p>
-    <w:p>
-      <w:pPr>
         <w:pStyle w:val="ListParagraph"/>
         <w:numPr>
           <w:ilvl w:val="0"/>
@@ -11491,7 +11576,29 @@
           <w:sz w:val="22"/>
           <w:szCs w:val="22"/>
         </w:rPr>
-        <w:t xml:space="preserve">TF-IDF 记忆检索引擎：从历史 StructuredIRV2 中提取 MemoryEntry，支持跨 Run 的知识检索。</w:t>
+        <w:t xml:space="preserve">TF-IDF 跨 Run 记忆检索引擎：从历史 StructuredIRV2 中提取 5 类 MemoryEntry（候选方向/决策摘要/关键主张/批判点/机会点），纯 Python stdlib 实现，字符 bigram + 余弦相似度，支持类型过滤与研究领域过滤。✓</w:t>
+      </w:r>
+    </w:p>
+    <w:p>
+      <w:pPr>
+        <w:spacing w:after="40" w:before="0"/>
+      </w:pPr>
+    </w:p>
+    <w:p>
+      <w:pPr>
+        <w:pStyle w:val="Heading2"/>
+        <w:spacing w:after="120" w:before="240"/>
+      </w:pPr>
+      <w:r>
+        <w:rPr>
+          <w:rFonts w:ascii="Arial" w:cs="Arial" w:eastAsia="Arial" w:hAnsi="Arial"/>
+          <w:b/>
+          <w:bCs/>
+          <w:color w:val="0A1628"/>
+          <w:sz w:val="26"/>
+          <w:szCs w:val="26"/>
+        </w:rPr>
+        <w:t xml:space="preserve">近期（规划中）</w:t>
       </w:r>
     </w:p>
     <w:p>
@@ -11512,29 +11619,7 @@
           <w:sz w:val="22"/>
           <w:szCs w:val="22"/>
         </w:rPr>
-        <w:t xml:space="preserve">PyInstaller 单文件封装：将前后端打包为本机可执行文件，消除 Python / Node 环境依赖。</w:t>
-      </w:r>
-    </w:p>
-    <w:p>
-      <w:pPr>
-        <w:spacing w:after="40" w:before="0"/>
-      </w:pPr>
-    </w:p>
-    <w:p>
-      <w:pPr>
-        <w:pStyle w:val="Heading2"/>
-        <w:spacing w:after="120" w:before="240"/>
-      </w:pPr>
-      <w:r>
-        <w:rPr>
-          <w:rFonts w:ascii="Arial" w:cs="Arial" w:eastAsia="Arial" w:hAnsi="Arial"/>
-          <w:b/>
-          <w:bCs/>
-          <w:color w:val="0A1628"/>
-          <w:sz w:val="26"/>
-          <w:szCs w:val="26"/>
-        </w:rPr>
-        <w:t xml:space="preserve">中期（规划中）</w:t>
+        <w:t xml:space="preserve">模式升级链路：实现 Quick Probe → Focused Panel → Full Deliberation 的自动化升级路径，允许用户在轻量探测发现问题后一键升级为完整讨论，历史上下文自动携带。</w:t>
       </w:r>
     </w:p>
     <w:p>
@@ -11560,6 +11645,28 @@
     </w:p>
     <w:p>
       <w:pPr>
+        <w:spacing w:after="40" w:before="0"/>
+      </w:pPr>
+    </w:p>
+    <w:p>
+      <w:pPr>
+        <w:pStyle w:val="Heading2"/>
+        <w:spacing w:after="120" w:before="240"/>
+      </w:pPr>
+      <w:r>
+        <w:rPr>
+          <w:rFonts w:ascii="Arial" w:cs="Arial" w:eastAsia="Arial" w:hAnsi="Arial"/>
+          <w:b/>
+          <w:bCs/>
+          <w:color w:val="0A1628"/>
+          <w:sz w:val="26"/>
+          <w:szCs w:val="26"/>
+        </w:rPr>
+        <w:t xml:space="preserve">待项目趋于稳定后</w:t>
+      </w:r>
+    </w:p>
+    <w:p>
+      <w:pPr>
         <w:pStyle w:val="ListParagraph"/>
         <w:numPr>
           <w:ilvl w:val="0"/>
@@ -11576,7 +11683,7 @@
           <w:sz w:val="22"/>
           <w:szCs w:val="22"/>
         </w:rPr>
-        <w:t xml:space="preserve">模式升级链路：实现 Quick Probe → Focused Panel → Full Deliberation 的自动化升级路径。</w:t>
+        <w:t xml:space="preserve">PyInstaller 单文件封装：将前后端打包为本机可执行文件，消除 Python / Node 环境依赖。适合在功能迭代趋于稳定后进行，避免频繁打包带来的双环境维护成本。</w:t>
       </w:r>
     </w:p>
     <w:p>

</xml_diff>

<commit_message>
docs: update architecture SVG to v2.0, add memory/ to project structure, add /api/memory/search to API table
</commit_message>
<xml_diff>
--- a/K-Storm-设计文档.docx
+++ b/K-Storm-设计文档.docx
@@ -1941,6 +1941,74 @@
       <w:pPr>
         <w:spacing w:after="80" w:before="0"/>
       </w:pPr>
+    </w:p>
+    <w:p>
+      <w:pPr>
+        <w:spacing w:after="80" w:before="0"/>
+      </w:pPr>
+    </w:p>
+    <w:p>
+      <w:pPr>
+        <w:spacing w:after="60" w:before="60"/>
+        <w:jc w:val="center"/>
+      </w:pPr>
+      <w:r>
+        <w:drawing>
+          <wp:inline distT="0" distB="0" distL="0" distR="0">
+            <wp:extent cx="5905500" cy="3933825"/>
+            <wp:effectExtent t="0" r="0" b="0" l="0"/>
+            <wp:docPr id="1" name="" descr="" title=""/>
+            <wp:cNvGraphicFramePr>
+              <a:graphicFrameLocks xmlns:a="http://schemas.openxmlformats.org/drawingml/2006/main" noChangeAspect="1"/>
+            </wp:cNvGraphicFramePr>
+            <a:graphic xmlns:a="http://schemas.openxmlformats.org/drawingml/2006/main">
+              <a:graphicData uri="http://schemas.openxmlformats.org/drawingml/2006/picture">
+                <pic:pic xmlns:pic="http://schemas.openxmlformats.org/drawingml/2006/picture">
+                  <pic:nvPicPr>
+                    <pic:cNvPr id="0" name="" descr=""/>
+                    <pic:cNvPicPr>
+                      <a:picLocks noChangeAspect="1" noChangeArrowheads="1"/>
+                    </pic:cNvPicPr>
+                  </pic:nvPicPr>
+                  <pic:blipFill>
+                    <a:blip r:embed="rId9" cstate="none"/>
+                    <a:srcRect/>
+                    <a:stretch>
+                      <a:fillRect/>
+                    </a:stretch>
+                  </pic:blipFill>
+                  <pic:spPr bwMode="auto">
+                    <a:xfrm>
+                      <a:off x="0" y="0"/>
+                      <a:ext cx="5905500" cy="3933825"/>
+                    </a:xfrm>
+                    <a:prstGeom prst="rect">
+                      <a:avLst/>
+                    </a:prstGeom>
+                  </pic:spPr>
+                </pic:pic>
+              </a:graphicData>
+            </a:graphic>
+          </wp:inline>
+        </w:drawing>
+      </w:r>
+    </w:p>
+    <w:p>
+      <w:pPr>
+        <w:spacing w:after="100" w:before="20"/>
+        <w:jc w:val="center"/>
+      </w:pPr>
+      <w:r>
+        <w:rPr>
+          <w:rFonts w:ascii="Arial" w:cs="Arial" w:eastAsia="Arial" w:hAnsi="Arial"/>
+          <w:i/>
+          <w:iCs/>
+          <w:color w:val="7A8BAD"/>
+          <w:sz w:val="18"/>
+          <w:szCs w:val="18"/>
+        </w:rPr>
+        <w:t xml:space="preserve">图 3-1  K-Storm v2.0 系统架构图</w:t>
+      </w:r>
     </w:p>
     <w:p>
       <w:pPr>

</xml_diff>

<commit_message>
feat: mode upgrade path — Quick Probe → Focused Panel → Full Deliberation
- backend/app/schemas/models.py: add upgrade_from_run_id to RunCreate/RunRecord; add UpgradeRequest schema
- backend/app/orchestrator/runner.py: add inject_upgrade_context() — injects prior run's brief/findings/IR/critique into new run's intake_synthesis; call in execute_run and execute_focused_panel
- backend/app/main.py: POST /api/runs/{run_id}/upgrade endpoint — validates upgrade direction, creates new run with context carry-over
- frontend/src/main.jsx: add ArrowUpCircle icon; add handleUpgrade(); show upgrade banner + button in RunOverview when run is COMPLETED and mode is quick/focused
- README.md / README.zh-CN.md: document upgrade chain and new API endpoint
- K-Storm-设计文档.docx: add section 5.1 with upgrade path table and context injection details
</commit_message>
<xml_diff>
--- a/K-Storm-设计文档.docx
+++ b/K-Storm-设计文档.docx
@@ -6354,7 +6354,7 @@
           <w:sz w:val="22"/>
           <w:szCs w:val="22"/>
         </w:rPr>
-        <w:t xml:space="preserve">K-Storm V1.6 设计了 4 种讨论模式，支持从「即席问答」到「完整审议」的全光谱覆盖，解决不同粒度的研究问题：</w:t>
+        <w:t xml:space="preserve">K-Storm V2.0 设计了 4 种讨论模式，支持从「即席问答」到「完整审议」的全光谱覆盖，解决不同粒度的研究问题：</w:t>
       </w:r>
     </w:p>
     <w:p>
@@ -6628,7 +6628,7 @@
                 <w:sz w:val="20"/>
                 <w:szCs w:val="20"/>
               </w:rPr>
-              <w:t xml:space="preserve">全量审议</w:t>
+              <w:t xml:space="preserve">完整讨论</w:t>
             </w:r>
           </w:p>
         </w:tc>
@@ -6663,7 +6663,7 @@
                 <w:sz w:val="20"/>
                 <w:szCs w:val="20"/>
               </w:rPr>
-              <w:t xml:space="preserve">全部 7 个</w:t>
+              <w:t xml:space="preserve">全部 9 个</w:t>
             </w:r>
           </w:p>
         </w:tc>
@@ -6805,7 +6805,7 @@
                 <w:sz w:val="20"/>
                 <w:szCs w:val="20"/>
               </w:rPr>
-              <w:t xml:space="preserve">专题研讨</w:t>
+              <w:t xml:space="preserve">聚焦研讨</w:t>
             </w:r>
           </w:p>
         </w:tc>
@@ -6982,7 +6982,7 @@
                 <w:sz w:val="20"/>
                 <w:szCs w:val="20"/>
               </w:rPr>
-              <w:t xml:space="preserve">快速探查</w:t>
+              <w:t xml:space="preserve">快速探测</w:t>
             </w:r>
           </w:p>
         </w:tc>
@@ -7274,6 +7274,23 @@
       <w:pPr>
         <w:spacing w:after="80" w:before="0"/>
       </w:pPr>
+    </w:p>
+    <w:p>
+      <w:pPr>
+        <w:pStyle w:val="Heading2"/>
+        <w:spacing w:after="120" w:before="240"/>
+      </w:pPr>
+      <w:r>
+        <w:rPr>
+          <w:rFonts w:ascii="Arial" w:cs="Arial" w:eastAsia="Arial" w:hAnsi="Arial"/>
+          <w:b/>
+          <w:bCs/>
+          <w:color w:val="0A1628"/>
+          <w:sz w:val="26"/>
+          <w:szCs w:val="26"/>
+        </w:rPr>
+        <w:t xml:space="preserve">5.1  模式升级链路（Mode Upgrade Path）</w:t>
+      </w:r>
     </w:p>
     <w:p>
       <w:pPr>
@@ -7288,7 +7305,503 @@
           <w:sz w:val="22"/>
           <w:szCs w:val="22"/>
         </w:rPr>
-        <w:t xml:space="preserve">模式之间形成升级链路：Memory Query → Quick Probe → Focused Panel → Full Deliberation。用户可以从最轻量入口发现问题，逐步加深投入，历史上下文在升级时自动携带，不重复从零开始。</w:t>
+        <w:t xml:space="preserve">四种模式构成线性升级链路：Quick Probe → Focused Panel → Full Deliberation。系统实现了一键升级机制，允许用户在轻量探测发现问题后，无需重新填写模板即可直接升级为更完整的讨论。</w:t>
+      </w:r>
+    </w:p>
+    <w:p>
+      <w:pPr>
+        <w:spacing w:after="40" w:before="0"/>
+      </w:pPr>
+    </w:p>
+    <w:tbl>
+      <w:tblPr>
+        <w:tblW w:type="dxa" w:w="9360"/>
+        <w:tblBorders>
+          <w:top w:val="single" w:color="auto" w:sz="4"/>
+          <w:left w:val="single" w:color="auto" w:sz="4"/>
+          <w:bottom w:val="single" w:color="auto" w:sz="4"/>
+          <w:right w:val="single" w:color="auto" w:sz="4"/>
+          <w:insideH w:val="single" w:color="auto" w:sz="4"/>
+          <w:insideV w:val="single" w:color="auto" w:sz="4"/>
+        </w:tblBorders>
+      </w:tblPr>
+      <w:tblGrid>
+        <w:gridCol w:w="2400"/>
+        <w:gridCol w:w="3160"/>
+        <w:gridCol w:w="3800"/>
+      </w:tblGrid>
+      <w:tr>
+        <w:trPr>
+          <w:tblHeader/>
+        </w:trPr>
+        <w:tc>
+          <w:tcPr>
+            <w:tcW w:type="dxa" w:w="2400"/>
+            <w:tcBorders>
+              <w:top w:val="single" w:color="1A52B8" w:sz="1"/>
+              <w:left w:val="single" w:color="1A52B8" w:sz="1"/>
+              <w:bottom w:val="single" w:color="1A52B8" w:sz="1"/>
+              <w:right w:val="single" w:color="1A52B8" w:sz="1"/>
+            </w:tcBorders>
+            <w:shd w:fill="1A52B8" w:val="clear"/>
+            <w:tcMar>
+              <w:top w:type="dxa" w:w="80"/>
+              <w:left w:type="dxa" w:w="120"/>
+              <w:bottom w:type="dxa" w:w="80"/>
+              <w:right w:type="dxa" w:w="120"/>
+            </w:tcMar>
+            <w:vAlign w:val="center"/>
+          </w:tcPr>
+          <w:p>
+            <w:pPr>
+              <w:spacing w:after="40" w:before="40"/>
+            </w:pPr>
+            <w:r>
+              <w:rPr>
+                <w:rFonts w:ascii="Arial" w:cs="Arial" w:eastAsia="Arial" w:hAnsi="Arial"/>
+                <w:b/>
+                <w:bCs/>
+                <w:color w:val="FFFFFF"/>
+                <w:sz w:val="20"/>
+                <w:szCs w:val="20"/>
+              </w:rPr>
+              <w:t xml:space="preserve">升级路径</w:t>
+            </w:r>
+          </w:p>
+        </w:tc>
+        <w:tc>
+          <w:tcPr>
+            <w:tcW w:type="dxa" w:w="3160"/>
+            <w:tcBorders>
+              <w:top w:val="single" w:color="1A52B8" w:sz="1"/>
+              <w:left w:val="single" w:color="1A52B8" w:sz="1"/>
+              <w:bottom w:val="single" w:color="1A52B8" w:sz="1"/>
+              <w:right w:val="single" w:color="1A52B8" w:sz="1"/>
+            </w:tcBorders>
+            <w:shd w:fill="1A52B8" w:val="clear"/>
+            <w:tcMar>
+              <w:top w:type="dxa" w:w="80"/>
+              <w:left w:type="dxa" w:w="120"/>
+              <w:bottom w:type="dxa" w:w="80"/>
+              <w:right w:type="dxa" w:w="120"/>
+            </w:tcMar>
+            <w:vAlign w:val="center"/>
+          </w:tcPr>
+          <w:p>
+            <w:pPr>
+              <w:spacing w:after="40" w:before="40"/>
+            </w:pPr>
+            <w:r>
+              <w:rPr>
+                <w:rFonts w:ascii="Arial" w:cs="Arial" w:eastAsia="Arial" w:hAnsi="Arial"/>
+                <w:b/>
+                <w:bCs/>
+                <w:color w:val="FFFFFF"/>
+                <w:sz w:val="20"/>
+                <w:szCs w:val="20"/>
+              </w:rPr>
+              <w:t xml:space="preserve">携带内容</w:t>
+            </w:r>
+          </w:p>
+        </w:tc>
+        <w:tc>
+          <w:tcPr>
+            <w:tcW w:type="dxa" w:w="3800"/>
+            <w:tcBorders>
+              <w:top w:val="single" w:color="1A52B8" w:sz="1"/>
+              <w:left w:val="single" w:color="1A52B8" w:sz="1"/>
+              <w:bottom w:val="single" w:color="1A52B8" w:sz="1"/>
+              <w:right w:val="single" w:color="1A52B8" w:sz="1"/>
+            </w:tcBorders>
+            <w:shd w:fill="1A52B8" w:val="clear"/>
+            <w:tcMar>
+              <w:top w:type="dxa" w:w="80"/>
+              <w:left w:type="dxa" w:w="120"/>
+              <w:bottom w:type="dxa" w:w="80"/>
+              <w:right w:type="dxa" w:w="120"/>
+            </w:tcMar>
+            <w:vAlign w:val="center"/>
+          </w:tcPr>
+          <w:p>
+            <w:pPr>
+              <w:spacing w:after="40" w:before="40"/>
+            </w:pPr>
+            <w:r>
+              <w:rPr>
+                <w:rFonts w:ascii="Arial" w:cs="Arial" w:eastAsia="Arial" w:hAnsi="Arial"/>
+                <w:b/>
+                <w:bCs/>
+                <w:color w:val="FFFFFF"/>
+                <w:sz w:val="20"/>
+                <w:szCs w:val="20"/>
+              </w:rPr>
+              <w:t xml:space="preserve">技术实现</w:t>
+            </w:r>
+          </w:p>
+        </w:tc>
+      </w:tr>
+      <w:tr>
+        <w:tc>
+          <w:tcPr>
+            <w:tcW w:type="dxa" w:w="2400"/>
+            <w:tcBorders>
+              <w:top w:val="single" w:color="D6E0F2" w:sz="1"/>
+              <w:left w:val="single" w:color="D6E0F2" w:sz="1"/>
+              <w:bottom w:val="single" w:color="D6E0F2" w:sz="1"/>
+              <w:right w:val="single" w:color="D6E0F2" w:sz="1"/>
+            </w:tcBorders>
+            <w:shd w:fill="FFFFFF" w:val="clear"/>
+            <w:tcMar>
+              <w:top w:type="dxa" w:w="80"/>
+              <w:left w:type="dxa" w:w="120"/>
+              <w:bottom w:type="dxa" w:w="80"/>
+              <w:right w:type="dxa" w:w="120"/>
+            </w:tcMar>
+            <w:vAlign w:val="center"/>
+          </w:tcPr>
+          <w:p>
+            <w:pPr>
+              <w:spacing w:after="40" w:before="40"/>
+            </w:pPr>
+            <w:r>
+              <w:rPr>
+                <w:rFonts w:ascii="Arial" w:cs="Arial" w:eastAsia="Arial" w:hAnsi="Arial"/>
+                <w:b w:val="false"/>
+                <w:bCs w:val="false"/>
+                <w:color w:val="0A1628"/>
+                <w:sz w:val="20"/>
+                <w:szCs w:val="20"/>
+              </w:rPr>
+              <w:t xml:space="preserve">Quick Probe → Focused Panel</w:t>
+            </w:r>
+          </w:p>
+        </w:tc>
+        <w:tc>
+          <w:tcPr>
+            <w:tcW w:type="dxa" w:w="3160"/>
+            <w:tcBorders>
+              <w:top w:val="single" w:color="D6E0F2" w:sz="1"/>
+              <w:left w:val="single" w:color="D6E0F2" w:sz="1"/>
+              <w:bottom w:val="single" w:color="D6E0F2" w:sz="1"/>
+              <w:right w:val="single" w:color="D6E0F2" w:sz="1"/>
+            </w:tcBorders>
+            <w:shd w:fill="FFFFFF" w:val="clear"/>
+            <w:tcMar>
+              <w:top w:type="dxa" w:w="80"/>
+              <w:left w:type="dxa" w:w="120"/>
+              <w:bottom w:type="dxa" w:w="80"/>
+              <w:right w:type="dxa" w:w="120"/>
+            </w:tcMar>
+            <w:vAlign w:val="center"/>
+          </w:tcPr>
+          <w:p>
+            <w:pPr>
+              <w:spacing w:after="40" w:before="40"/>
+            </w:pPr>
+            <w:r>
+              <w:rPr>
+                <w:rFonts w:ascii="Arial" w:cs="Arial" w:eastAsia="Arial" w:hAnsi="Arial"/>
+                <w:b w:val="false"/>
+                <w:bCs w:val="false"/>
+                <w:color w:val="0A1628"/>
+                <w:sz w:val="20"/>
+                <w:szCs w:val="20"/>
+              </w:rPr>
+              <w:t xml:space="preserve">探测问题 + 完整回答（≤1200字）</w:t>
+            </w:r>
+          </w:p>
+        </w:tc>
+        <w:tc>
+          <w:tcPr>
+            <w:tcW w:type="dxa" w:w="3800"/>
+            <w:tcBorders>
+              <w:top w:val="single" w:color="D6E0F2" w:sz="1"/>
+              <w:left w:val="single" w:color="D6E0F2" w:sz="1"/>
+              <w:bottom w:val="single" w:color="D6E0F2" w:sz="1"/>
+              <w:right w:val="single" w:color="D6E0F2" w:sz="1"/>
+            </w:tcBorders>
+            <w:shd w:fill="FFFFFF" w:val="clear"/>
+            <w:tcMar>
+              <w:top w:type="dxa" w:w="80"/>
+              <w:left w:type="dxa" w:w="120"/>
+              <w:bottom w:type="dxa" w:w="80"/>
+              <w:right w:type="dxa" w:w="120"/>
+            </w:tcMar>
+            <w:vAlign w:val="center"/>
+          </w:tcPr>
+          <w:p>
+            <w:pPr>
+              <w:spacing w:after="40" w:before="40"/>
+            </w:pPr>
+            <w:r>
+              <w:rPr>
+                <w:rFonts w:ascii="Arial" w:cs="Arial" w:eastAsia="Arial" w:hAnsi="Arial"/>
+                <w:b w:val="false"/>
+                <w:bCs w:val="false"/>
+                <w:color w:val="0A1628"/>
+                <w:sz w:val="20"/>
+                <w:szCs w:val="20"/>
+              </w:rPr>
+              <w:t xml:space="preserve">upgrade_from_run_id 注入，inject_upgrade_context() 追加至 intake_synthesis</w:t>
+            </w:r>
+          </w:p>
+        </w:tc>
+      </w:tr>
+      <w:tr>
+        <w:tc>
+          <w:tcPr>
+            <w:tcW w:type="dxa" w:w="2400"/>
+            <w:tcBorders>
+              <w:top w:val="single" w:color="D6E0F2" w:sz="1"/>
+              <w:left w:val="single" w:color="D6E0F2" w:sz="1"/>
+              <w:bottom w:val="single" w:color="D6E0F2" w:sz="1"/>
+              <w:right w:val="single" w:color="D6E0F2" w:sz="1"/>
+            </w:tcBorders>
+            <w:shd w:fill="EEF2FA" w:val="clear"/>
+            <w:tcMar>
+              <w:top w:type="dxa" w:w="80"/>
+              <w:left w:type="dxa" w:w="120"/>
+              <w:bottom w:type="dxa" w:w="80"/>
+              <w:right w:type="dxa" w:w="120"/>
+            </w:tcMar>
+            <w:vAlign w:val="center"/>
+          </w:tcPr>
+          <w:p>
+            <w:pPr>
+              <w:spacing w:after="40" w:before="40"/>
+            </w:pPr>
+            <w:r>
+              <w:rPr>
+                <w:rFonts w:ascii="Arial" w:cs="Arial" w:eastAsia="Arial" w:hAnsi="Arial"/>
+                <w:b w:val="false"/>
+                <w:bCs w:val="false"/>
+                <w:color w:val="0A1628"/>
+                <w:sz w:val="20"/>
+                <w:szCs w:val="20"/>
+              </w:rPr>
+              <w:t xml:space="preserve">Quick Probe → Full Deliberation</w:t>
+            </w:r>
+          </w:p>
+        </w:tc>
+        <w:tc>
+          <w:tcPr>
+            <w:tcW w:type="dxa" w:w="3160"/>
+            <w:tcBorders>
+              <w:top w:val="single" w:color="D6E0F2" w:sz="1"/>
+              <w:left w:val="single" w:color="D6E0F2" w:sz="1"/>
+              <w:bottom w:val="single" w:color="D6E0F2" w:sz="1"/>
+              <w:right w:val="single" w:color="D6E0F2" w:sz="1"/>
+            </w:tcBorders>
+            <w:shd w:fill="EEF2FA" w:val="clear"/>
+            <w:tcMar>
+              <w:top w:type="dxa" w:w="80"/>
+              <w:left w:type="dxa" w:w="120"/>
+              <w:bottom w:type="dxa" w:w="80"/>
+              <w:right w:type="dxa" w:w="120"/>
+            </w:tcMar>
+            <w:vAlign w:val="center"/>
+          </w:tcPr>
+          <w:p>
+            <w:pPr>
+              <w:spacing w:after="40" w:before="40"/>
+            </w:pPr>
+            <w:r>
+              <w:rPr>
+                <w:rFonts w:ascii="Arial" w:cs="Arial" w:eastAsia="Arial" w:hAnsi="Arial"/>
+                <w:b w:val="false"/>
+                <w:bCs w:val="false"/>
+                <w:color w:val="0A1628"/>
+                <w:sz w:val="20"/>
+                <w:szCs w:val="20"/>
+              </w:rPr>
+              <w:t xml:space="preserve">探测问题 + 完整回答 + 候选方向（如已有 IR）</w:t>
+            </w:r>
+          </w:p>
+        </w:tc>
+        <w:tc>
+          <w:tcPr>
+            <w:tcW w:type="dxa" w:w="3800"/>
+            <w:tcBorders>
+              <w:top w:val="single" w:color="D6E0F2" w:sz="1"/>
+              <w:left w:val="single" w:color="D6E0F2" w:sz="1"/>
+              <w:bottom w:val="single" w:color="D6E0F2" w:sz="1"/>
+              <w:right w:val="single" w:color="D6E0F2" w:sz="1"/>
+            </w:tcBorders>
+            <w:shd w:fill="EEF2FA" w:val="clear"/>
+            <w:tcMar>
+              <w:top w:type="dxa" w:w="80"/>
+              <w:left w:type="dxa" w:w="120"/>
+              <w:bottom w:type="dxa" w:w="80"/>
+              <w:right w:type="dxa" w:w="120"/>
+            </w:tcMar>
+            <w:vAlign w:val="center"/>
+          </w:tcPr>
+          <w:p>
+            <w:pPr>
+              <w:spacing w:after="40" w:before="40"/>
+            </w:pPr>
+            <w:r>
+              <w:rPr>
+                <w:rFonts w:ascii="Arial" w:cs="Arial" w:eastAsia="Arial" w:hAnsi="Arial"/>
+                <w:b w:val="false"/>
+                <w:bCs w:val="false"/>
+                <w:color w:val="0A1628"/>
+                <w:sz w:val="20"/>
+                <w:szCs w:val="20"/>
+              </w:rPr>
+              <w:t xml:space="preserve">同上，目标模式为 full</w:t>
+            </w:r>
+          </w:p>
+        </w:tc>
+      </w:tr>
+      <w:tr>
+        <w:tc>
+          <w:tcPr>
+            <w:tcW w:type="dxa" w:w="2400"/>
+            <w:tcBorders>
+              <w:top w:val="single" w:color="D6E0F2" w:sz="1"/>
+              <w:left w:val="single" w:color="D6E0F2" w:sz="1"/>
+              <w:bottom w:val="single" w:color="D6E0F2" w:sz="1"/>
+              <w:right w:val="single" w:color="D6E0F2" w:sz="1"/>
+            </w:tcBorders>
+            <w:shd w:fill="FFFFFF" w:val="clear"/>
+            <w:tcMar>
+              <w:top w:type="dxa" w:w="80"/>
+              <w:left w:type="dxa" w:w="120"/>
+              <w:bottom w:type="dxa" w:w="80"/>
+              <w:right w:type="dxa" w:w="120"/>
+            </w:tcMar>
+            <w:vAlign w:val="center"/>
+          </w:tcPr>
+          <w:p>
+            <w:pPr>
+              <w:spacing w:after="40" w:before="40"/>
+            </w:pPr>
+            <w:r>
+              <w:rPr>
+                <w:rFonts w:ascii="Arial" w:cs="Arial" w:eastAsia="Arial" w:hAnsi="Arial"/>
+                <w:b w:val="false"/>
+                <w:bCs w:val="false"/>
+                <w:color w:val="0A1628"/>
+                <w:sz w:val="20"/>
+                <w:szCs w:val="20"/>
+              </w:rPr>
+              <w:t xml:space="preserve">Focused Panel → Full Deliberation</w:t>
+            </w:r>
+          </w:p>
+        </w:tc>
+        <w:tc>
+          <w:tcPr>
+            <w:tcW w:type="dxa" w:w="3160"/>
+            <w:tcBorders>
+              <w:top w:val="single" w:color="D6E0F2" w:sz="1"/>
+              <w:left w:val="single" w:color="D6E0F2" w:sz="1"/>
+              <w:bottom w:val="single" w:color="D6E0F2" w:sz="1"/>
+              <w:right w:val="single" w:color="D6E0F2" w:sz="1"/>
+            </w:tcBorders>
+            <w:shd w:fill="FFFFFF" w:val="clear"/>
+            <w:tcMar>
+              <w:top w:type="dxa" w:w="80"/>
+              <w:left w:type="dxa" w:w="120"/>
+              <w:bottom w:type="dxa" w:w="80"/>
+              <w:right w:type="dxa" w:w="120"/>
+            </w:tcMar>
+            <w:vAlign w:val="center"/>
+          </w:tcPr>
+          <w:p>
+            <w:pPr>
+              <w:spacing w:after="40" w:before="40"/>
+            </w:pPr>
+            <w:r>
+              <w:rPr>
+                <w:rFonts w:ascii="Arial" w:cs="Arial" w:eastAsia="Arial" w:hAnsi="Arial"/>
+                <w:b w:val="false"/>
+                <w:bCs w:val="false"/>
+                <w:color w:val="0A1628"/>
+                <w:sz w:val="20"/>
+                <w:szCs w:val="20"/>
+              </w:rPr>
+              <w:t xml:space="preserve">聚焦研讨摘要 + 结构化 IR + 独立批判报告（≤1200字/段）</w:t>
+            </w:r>
+          </w:p>
+        </w:tc>
+        <w:tc>
+          <w:tcPr>
+            <w:tcW w:type="dxa" w:w="3800"/>
+            <w:tcBorders>
+              <w:top w:val="single" w:color="D6E0F2" w:sz="1"/>
+              <w:left w:val="single" w:color="D6E0F2" w:sz="1"/>
+              <w:bottom w:val="single" w:color="D6E0F2" w:sz="1"/>
+              <w:right w:val="single" w:color="D6E0F2" w:sz="1"/>
+            </w:tcBorders>
+            <w:shd w:fill="FFFFFF" w:val="clear"/>
+            <w:tcMar>
+              <w:top w:type="dxa" w:w="80"/>
+              <w:left w:type="dxa" w:w="120"/>
+              <w:bottom w:type="dxa" w:w="80"/>
+              <w:right w:type="dxa" w:w="120"/>
+            </w:tcMar>
+            <w:vAlign w:val="center"/>
+          </w:tcPr>
+          <w:p>
+            <w:pPr>
+              <w:spacing w:after="40" w:before="40"/>
+            </w:pPr>
+            <w:r>
+              <w:rPr>
+                <w:rFonts w:ascii="Arial" w:cs="Arial" w:eastAsia="Arial" w:hAnsi="Arial"/>
+                <w:b w:val="false"/>
+                <w:bCs w:val="false"/>
+                <w:color w:val="0A1628"/>
+                <w:sz w:val="20"/>
+                <w:szCs w:val="20"/>
+              </w:rPr>
+              <w:t xml:space="preserve">inject_upgrade_context() 注入多维度前序发现</w:t>
+            </w:r>
+          </w:p>
+        </w:tc>
+      </w:tr>
+    </w:tbl>
+    <w:p>
+      <w:pPr>
+        <w:spacing w:after="40" w:before="0"/>
+      </w:pPr>
+    </w:p>
+    <w:p>
+      <w:pPr>
+        <w:spacing w:after="80" w:before="60"/>
+      </w:pPr>
+      <w:r>
+        <w:rPr>
+          <w:rFonts w:ascii="Arial" w:cs="Arial" w:eastAsia="Arial" w:hAnsi="Arial"/>
+          <w:b w:val="false"/>
+          <w:bCs w:val="false"/>
+          <w:color w:val="0A1628"/>
+          <w:sz w:val="22"/>
+          <w:szCs w:val="22"/>
+        </w:rPr>
+        <w:t xml:space="preserve">上下文注入机制：新 Run 的 Intake Agent 生成基础 briefing 后，inject_upgrade_context() 自动读取 upgrade_from_run_id 所指向的源 Run，提取关键发现（探测问题与回答、聚焦讨论摘要、结构化 IR 候选方向、批判报告），以 Markdown 小节形式追加至 intake_synthesis。讨论组的每个 Agent 均在升级上下文可见的前提下展开推理，避免重复探索已知结论。</w:t>
+      </w:r>
+    </w:p>
+    <w:p>
+      <w:pPr>
+        <w:spacing w:after="40" w:before="0"/>
+      </w:pPr>
+    </w:p>
+    <w:p>
+      <w:pPr>
+        <w:spacing w:after="80" w:before="60"/>
+      </w:pPr>
+      <w:r>
+        <w:rPr>
+          <w:rFonts w:ascii="Arial" w:cs="Arial" w:eastAsia="Arial" w:hAnsi="Arial"/>
+          <w:b w:val="false"/>
+          <w:bCs w:val="false"/>
+          <w:color w:val="0A1628"/>
+          <w:sz w:val="22"/>
+          <w:szCs w:val="22"/>
+        </w:rPr>
+        <w:t xml:space="preserve">前端交互：任意 Quick Probe 或 Focused Panel 运行完成后，运行概览头部出现蓝色「升级为聚焦研讨」或「升级为完整讨论」按钮，一键调用 POST /api/runs/{id}/upgrade 创建新 Run 并自动切换到新 Run 的轮询状态。新 Run 名称自动标注「[升级→完整讨论] 源名称」。</w:t>
       </w:r>
     </w:p>
     <w:p>

</xml_diff>